<commit_message>
templates folder direct upload
</commit_message>
<xml_diff>
--- a/assets/templates/sample-course-content-notes.docx
+++ b/assets/templates/sample-course-content-notes.docx
@@ -1,3 +1,2206 @@
+
+<file path=word/document.xml><?xml version="1.0" encoding="utf-8"?>
+<w:document xmlns:wpc="http://schemas.microsoft.com/office/word/2010/wordprocessingCanvas" xmlns:cx="http://schemas.microsoft.com/office/drawing/2014/chartex" xmlns:cx1="http://schemas.microsoft.com/office/drawing/2015/9/8/chartex" xmlns:mc="http://schemas.openxmlformats.org/markup-compatibility/2006" xmlns:o="urn:schemas-microsoft-com:office:office" xmlns:r="http://schemas.openxmlformats.org/officeDocument/2006/relationships" xmlns:m="http://schemas.openxmlformats.org/officeDocument/2006/math" xmlns:v="urn:schemas-microsoft-com:vml" xmlns:wp14="http://schemas.microsoft.com/office/word/2010/wordprocessingDrawing" xmlns:wp="http://schemas.openxmlformats.org/drawingml/2006/wordprocessingDrawing" xmlns:w10="urn:schemas-microsoft-com:office:word" xmlns:w="http://schemas.openxmlformats.org/wordprocessingml/2006/main" xmlns:w14="http://schemas.microsoft.com/office/word/2010/wordml" xmlns:w15="http://schemas.microsoft.com/office/word/2012/wordml" xmlns:w16se="http://schemas.microsoft.com/office/word/2015/wordml/symex" xmlns:wpg="http://schemas.microsoft.com/office/word/2010/wordprocessingGroup" xmlns:wpi="http://schemas.microsoft.com/office/word/2010/wordprocessingInk" xmlns:wne="http://schemas.microsoft.com/office/word/2006/wordml" xmlns:wps="http://schemas.microsoft.com/office/word/2010/wordprocessingShape" mc:Ignorable="w14 w15 w16se wp14">
+  <w:body>
+    <w:p>
+      <w:pPr>
+        <w:pStyle w:val="Title"/>
+      </w:pPr>
+      <w:bookmarkStart w:id="0" w:name="_GoBack"/>
+      <w:bookmarkEnd w:id="0"/>
+      <w:r>
+        <w:t>Module 0</w:t>
+      </w:r>
+      <w:r>
+        <w:t xml:space="preserve"> - Introduction</w:t>
+      </w:r>
+    </w:p>
+    <w:p>
+      <w:pPr>
+        <w:rPr>
+          <w:rFonts w:cstheme="minorHAnsi"/>
+        </w:rPr>
+      </w:pPr>
+    </w:p>
+    <w:p>
+      <w:pPr>
+        <w:pStyle w:val="Heading1"/>
+      </w:pPr>
+      <w:r>
+        <w:t>Course Outline</w:t>
+      </w:r>
+    </w:p>
+    <w:p/>
+    <w:p>
+      <w:pPr>
+        <w:pStyle w:val="ListParagraph"/>
+        <w:numPr>
+          <w:ilvl w:val="0"/>
+          <w:numId w:val="11"/>
+        </w:numPr>
+        <w:rPr>
+          <w:rFonts w:cstheme="minorHAnsi"/>
+        </w:rPr>
+      </w:pPr>
+      <w:r>
+        <w:rPr>
+          <w:rFonts w:cstheme="minorHAnsi"/>
+        </w:rPr>
+        <w:t>Link to BCIT outline</w:t>
+      </w:r>
+    </w:p>
+    <w:p>
+      <w:pPr>
+        <w:pStyle w:val="ListParagraph"/>
+        <w:numPr>
+          <w:ilvl w:val="1"/>
+          <w:numId w:val="11"/>
+        </w:numPr>
+        <w:rPr>
+          <w:rFonts w:cstheme="minorHAnsi"/>
+        </w:rPr>
+      </w:pPr>
+      <w:r>
+        <w:rPr>
+          <w:rFonts w:cstheme="minorHAnsi"/>
+        </w:rPr>
+        <w:t>should be a link to the general BCIT course outline page</w:t>
+      </w:r>
+    </w:p>
+    <w:p>
+      <w:pPr>
+        <w:rPr>
+          <w:rFonts w:cstheme="minorHAnsi"/>
+        </w:rPr>
+      </w:pPr>
+    </w:p>
+    <w:p>
+      <w:pPr>
+        <w:pStyle w:val="Heading1"/>
+      </w:pPr>
+      <w:r>
+        <w:t>Study Guide</w:t>
+      </w:r>
+    </w:p>
+    <w:p>
+      <w:pPr>
+        <w:rPr>
+          <w:rFonts w:cstheme="minorHAnsi"/>
+          <w:b/>
+        </w:rPr>
+      </w:pPr>
+    </w:p>
+    <w:p>
+      <w:pPr>
+        <w:pStyle w:val="ListParagraph"/>
+        <w:numPr>
+          <w:ilvl w:val="0"/>
+          <w:numId w:val="3"/>
+        </w:numPr>
+        <w:rPr>
+          <w:rFonts w:cstheme="minorHAnsi"/>
+        </w:rPr>
+      </w:pPr>
+      <w:r>
+        <w:rPr>
+          <w:rFonts w:cstheme="minorHAnsi"/>
+        </w:rPr>
+        <w:t>Should be in the course files as both a Word doc and a PDF</w:t>
+      </w:r>
+    </w:p>
+    <w:p>
+      <w:pPr>
+        <w:pStyle w:val="ListParagraph"/>
+        <w:numPr>
+          <w:ilvl w:val="0"/>
+          <w:numId w:val="3"/>
+        </w:numPr>
+        <w:rPr>
+          <w:rFonts w:cstheme="minorHAnsi"/>
+        </w:rPr>
+      </w:pPr>
+      <w:r>
+        <w:rPr>
+          <w:rFonts w:cstheme="minorHAnsi"/>
+        </w:rPr>
+        <w:t xml:space="preserve">The PDF version is the one that goes </w:t>
+      </w:r>
+      <w:r>
+        <w:rPr>
+          <w:rFonts w:cstheme="minorHAnsi"/>
+        </w:rPr>
+        <w:t>online</w:t>
+      </w:r>
+      <w:r>
+        <w:rPr>
+          <w:rFonts w:cstheme="minorHAnsi"/>
+        </w:rPr>
+        <w:t xml:space="preserve"> for students</w:t>
+      </w:r>
+    </w:p>
+    <w:p>
+      <w:pPr>
+        <w:pStyle w:val="ListParagraph"/>
+        <w:numPr>
+          <w:ilvl w:val="0"/>
+          <w:numId w:val="3"/>
+        </w:numPr>
+        <w:rPr>
+          <w:rFonts w:cstheme="minorHAnsi"/>
+        </w:rPr>
+      </w:pPr>
+      <w:r>
+        <w:rPr>
+          <w:rFonts w:cstheme="minorHAnsi"/>
+        </w:rPr>
+        <w:t>This file is created by the program. It can be created as soon as assignment dates</w:t>
+      </w:r>
+      <w:r>
+        <w:rPr>
+          <w:rFonts w:cstheme="minorHAnsi"/>
+        </w:rPr>
+        <w:t xml:space="preserve"> and activity dates</w:t>
+      </w:r>
+      <w:r>
+        <w:rPr>
+          <w:rFonts w:cstheme="minorHAnsi"/>
+        </w:rPr>
+        <w:t xml:space="preserve"> are set and modules are titled.</w:t>
+      </w:r>
+    </w:p>
+    <w:p>
+      <w:pPr>
+        <w:pStyle w:val="ListParagraph"/>
+        <w:numPr>
+          <w:ilvl w:val="0"/>
+          <w:numId w:val="3"/>
+        </w:numPr>
+        <w:rPr>
+          <w:rFonts w:cstheme="minorHAnsi"/>
+        </w:rPr>
+      </w:pPr>
+      <w:r>
+        <w:rPr>
+          <w:rFonts w:cstheme="minorHAnsi"/>
+        </w:rPr>
+        <w:t>The IDC should let the program know when the information is avai</w:t>
+      </w:r>
+      <w:r>
+        <w:rPr>
+          <w:rFonts w:cstheme="minorHAnsi"/>
+        </w:rPr>
+        <w:t>lable</w:t>
+      </w:r>
+    </w:p>
+    <w:p>
+      <w:pPr>
+        <w:pStyle w:val="ListParagraph"/>
+        <w:numPr>
+          <w:ilvl w:val="0"/>
+          <w:numId w:val="3"/>
+        </w:numPr>
+        <w:rPr>
+          <w:rFonts w:cstheme="minorHAnsi"/>
+        </w:rPr>
+      </w:pPr>
+      <w:r>
+        <w:rPr>
+          <w:rFonts w:cstheme="minorHAnsi"/>
+        </w:rPr>
+        <w:t>The program should populate their template for the study guide and send it back to the L</w:t>
+      </w:r>
+      <w:r>
+        <w:rPr>
+          <w:rFonts w:cstheme="minorHAnsi"/>
+        </w:rPr>
+        <w:t>TC to be uploaded to the course</w:t>
+      </w:r>
+    </w:p>
+    <w:p>
+      <w:pPr>
+        <w:rPr>
+          <w:rFonts w:cstheme="minorHAnsi"/>
+        </w:rPr>
+      </w:pPr>
+    </w:p>
+    <w:p>
+      <w:pPr>
+        <w:pStyle w:val="Heading1"/>
+      </w:pPr>
+      <w:r>
+        <w:t>About This Course</w:t>
+      </w:r>
+    </w:p>
+    <w:p>
+      <w:pPr>
+        <w:rPr>
+          <w:rFonts w:cstheme="minorHAnsi"/>
+        </w:rPr>
+      </w:pPr>
+    </w:p>
+    <w:p>
+      <w:pPr>
+        <w:pStyle w:val="ListParagraph"/>
+        <w:numPr>
+          <w:ilvl w:val="0"/>
+          <w:numId w:val="4"/>
+        </w:numPr>
+        <w:rPr>
+          <w:rFonts w:cstheme="minorHAnsi"/>
+        </w:rPr>
+      </w:pPr>
+      <w:r>
+        <w:rPr>
+          <w:rFonts w:cstheme="minorHAnsi"/>
+        </w:rPr>
+        <w:t>Page title</w:t>
+      </w:r>
+      <w:r>
+        <w:rPr>
+          <w:rFonts w:cstheme="minorHAnsi"/>
+        </w:rPr>
+        <w:t xml:space="preserve"> =</w:t>
+      </w:r>
+      <w:r>
+        <w:rPr>
+          <w:rFonts w:cstheme="minorHAnsi"/>
+        </w:rPr>
+        <w:t xml:space="preserve"> </w:t>
+      </w:r>
+      <w:r>
+        <w:rPr>
+          <w:rFonts w:cstheme="minorHAnsi"/>
+        </w:rPr>
+        <w:t>“</w:t>
+      </w:r>
+      <w:r>
+        <w:rPr>
+          <w:rFonts w:cstheme="minorHAnsi"/>
+          <w:i/>
+        </w:rPr>
+        <w:t>About this course</w:t>
+      </w:r>
+      <w:r>
+        <w:rPr>
+          <w:rFonts w:cstheme="minorHAnsi"/>
+        </w:rPr>
+        <w:t>”</w:t>
+      </w:r>
+    </w:p>
+    <w:p>
+      <w:pPr>
+        <w:pStyle w:val="ListParagraph"/>
+        <w:numPr>
+          <w:ilvl w:val="0"/>
+          <w:numId w:val="4"/>
+        </w:numPr>
+        <w:rPr>
+          <w:rFonts w:cstheme="minorHAnsi"/>
+        </w:rPr>
+      </w:pPr>
+      <w:r>
+        <w:rPr>
+          <w:rFonts w:cstheme="minorHAnsi"/>
+        </w:rPr>
+        <w:t>Text at the top:</w:t>
+      </w:r>
+    </w:p>
+    <w:p>
+      <w:pPr>
+        <w:pStyle w:val="Quote"/>
+        <w:rPr>
+          <w:rFonts w:cstheme="minorHAnsi"/>
+        </w:rPr>
+      </w:pPr>
+      <w:r>
+        <w:rPr>
+          <w:rFonts w:cstheme="minorHAnsi"/>
+        </w:rPr>
+        <w:t>“</w:t>
+      </w:r>
+      <w:r>
+        <w:rPr>
+          <w:rFonts w:cstheme="minorHAnsi"/>
+        </w:rPr>
+        <w:t xml:space="preserve">Welcome to </w:t>
+      </w:r>
+      <w:r>
+        <w:rPr>
+          <w:rFonts w:cstheme="minorHAnsi"/>
+        </w:rPr>
+        <w:t>{</w:t>
+      </w:r>
+      <w:proofErr w:type="spellStart"/>
+      <w:r>
+        <w:rPr>
+          <w:rFonts w:cstheme="minorHAnsi"/>
+        </w:rPr>
+        <w:t>c</w:t>
+      </w:r>
+      <w:r>
+        <w:rPr>
+          <w:rFonts w:cstheme="minorHAnsi"/>
+        </w:rPr>
+        <w:t>ourseTitle</w:t>
+      </w:r>
+      <w:proofErr w:type="spellEnd"/>
+      <w:r>
+        <w:rPr>
+          <w:rFonts w:cstheme="minorHAnsi"/>
+        </w:rPr>
+        <w:t>}</w:t>
+      </w:r>
+      <w:r>
+        <w:rPr>
+          <w:rFonts w:cstheme="minorHAnsi"/>
+        </w:rPr>
+        <w:t xml:space="preserve">, another course in BCIT’s </w:t>
+      </w:r>
+      <w:r>
+        <w:rPr>
+          <w:rFonts w:cstheme="minorHAnsi"/>
+        </w:rPr>
+        <w:t>{program}</w:t>
+      </w:r>
+      <w:r>
+        <w:rPr>
+          <w:rFonts w:cstheme="minorHAnsi"/>
+        </w:rPr>
+        <w:t xml:space="preserve"> program.</w:t>
+      </w:r>
+      <w:r>
+        <w:rPr>
+          <w:rFonts w:cstheme="minorHAnsi"/>
+        </w:rPr>
+        <w:t>”</w:t>
+      </w:r>
+    </w:p>
+    <w:p>
+      <w:pPr>
+        <w:pStyle w:val="ListParagraph"/>
+        <w:numPr>
+          <w:ilvl w:val="0"/>
+          <w:numId w:val="4"/>
+        </w:numPr>
+        <w:rPr>
+          <w:rFonts w:cstheme="minorHAnsi"/>
+        </w:rPr>
+      </w:pPr>
+      <w:r>
+        <w:rPr>
+          <w:rFonts w:eastAsia="Times New Roman" w:cstheme="minorHAnsi"/>
+        </w:rPr>
+        <w:t xml:space="preserve">Video </w:t>
+      </w:r>
+      <w:r>
+        <w:rPr>
+          <w:rFonts w:eastAsia="Times New Roman" w:cstheme="minorHAnsi"/>
+        </w:rPr>
+        <w:t>centered</w:t>
+      </w:r>
+      <w:r>
+        <w:rPr>
+          <w:rFonts w:eastAsia="Times New Roman" w:cstheme="minorHAnsi"/>
+        </w:rPr>
+        <w:t xml:space="preserve"> and embedded</w:t>
+      </w:r>
+    </w:p>
+    <w:p>
+      <w:pPr>
+        <w:pStyle w:val="ListParagraph"/>
+        <w:numPr>
+          <w:ilvl w:val="1"/>
+          <w:numId w:val="4"/>
+        </w:numPr>
+        <w:rPr>
+          <w:rFonts w:cstheme="minorHAnsi"/>
+        </w:rPr>
+      </w:pPr>
+      <w:r>
+        <w:rPr>
+          <w:rFonts w:eastAsia="Times New Roman" w:cstheme="minorHAnsi"/>
+        </w:rPr>
+        <w:t>Program arranges for videos to be made</w:t>
+      </w:r>
+    </w:p>
+    <w:p>
+      <w:pPr>
+        <w:pStyle w:val="ListParagraph"/>
+        <w:numPr>
+          <w:ilvl w:val="1"/>
+          <w:numId w:val="4"/>
+        </w:numPr>
+        <w:rPr>
+          <w:rFonts w:cstheme="minorHAnsi"/>
+        </w:rPr>
+      </w:pPr>
+      <w:r>
+        <w:rPr>
+          <w:rFonts w:eastAsia="Times New Roman" w:cstheme="minorHAnsi"/>
+        </w:rPr>
+        <w:t>Subject Matter Expert, IDC</w:t>
+      </w:r>
+      <w:r>
+        <w:rPr>
+          <w:rFonts w:eastAsia="Times New Roman" w:cstheme="minorHAnsi"/>
+        </w:rPr>
+        <w:t xml:space="preserve"> or Program Head write script</w:t>
+      </w:r>
+    </w:p>
+    <w:p>
+      <w:pPr>
+        <w:pStyle w:val="ListParagraph"/>
+        <w:numPr>
+          <w:ilvl w:val="2"/>
+          <w:numId w:val="4"/>
+        </w:numPr>
+        <w:rPr>
+          <w:rFonts w:cstheme="minorHAnsi"/>
+        </w:rPr>
+      </w:pPr>
+      <w:r>
+        <w:rPr>
+          <w:rFonts w:eastAsia="Times New Roman" w:cstheme="minorHAnsi"/>
+        </w:rPr>
+        <w:t>approximately one minute for the course intro</w:t>
+      </w:r>
+    </w:p>
+    <w:p>
+      <w:pPr>
+        <w:rPr>
+          <w:rFonts w:cstheme="minorHAnsi"/>
+        </w:rPr>
+      </w:pPr>
+    </w:p>
+    <w:p>
+      <w:pPr>
+        <w:pStyle w:val="ListParagraph"/>
+        <w:numPr>
+          <w:ilvl w:val="0"/>
+          <w:numId w:val="4"/>
+        </w:numPr>
+        <w:rPr>
+          <w:rFonts w:cstheme="minorHAnsi"/>
+        </w:rPr>
+      </w:pPr>
+      <w:r>
+        <w:rPr>
+          <w:rFonts w:eastAsia="Times New Roman" w:cstheme="minorHAnsi"/>
+        </w:rPr>
+        <w:t>Reveal is used for transcript</w:t>
+      </w:r>
+    </w:p>
+    <w:p>
+      <w:pPr>
+        <w:pStyle w:val="ListParagraph"/>
+        <w:numPr>
+          <w:ilvl w:val="1"/>
+          <w:numId w:val="4"/>
+        </w:numPr>
+        <w:rPr>
+          <w:rFonts w:cstheme="minorHAnsi"/>
+        </w:rPr>
+      </w:pPr>
+      <w:r>
+        <w:rPr>
+          <w:rFonts w:eastAsia="Times New Roman" w:cstheme="minorHAnsi"/>
+        </w:rPr>
+        <w:t>Reveal b</w:t>
+      </w:r>
+      <w:r>
+        <w:rPr>
+          <w:rFonts w:eastAsia="Times New Roman" w:cstheme="minorHAnsi"/>
+        </w:rPr>
+        <w:t xml:space="preserve">utton </w:t>
+      </w:r>
+      <w:r>
+        <w:rPr>
+          <w:rFonts w:eastAsia="Times New Roman" w:cstheme="minorHAnsi"/>
+        </w:rPr>
+        <w:t>=</w:t>
+      </w:r>
+      <w:r>
+        <w:rPr>
+          <w:rFonts w:eastAsia="Times New Roman" w:cstheme="minorHAnsi"/>
+        </w:rPr>
+        <w:t xml:space="preserve"> “Transcript”</w:t>
+      </w:r>
+    </w:p>
+    <w:p>
+      <w:pPr>
+        <w:rPr>
+          <w:rFonts w:cstheme="minorHAnsi"/>
+        </w:rPr>
+      </w:pPr>
+    </w:p>
+    <w:p>
+      <w:pPr>
+        <w:pStyle w:val="ListParagraph"/>
+        <w:numPr>
+          <w:ilvl w:val="0"/>
+          <w:numId w:val="4"/>
+        </w:numPr>
+        <w:rPr>
+          <w:rFonts w:cstheme="minorHAnsi"/>
+        </w:rPr>
+      </w:pPr>
+      <w:r>
+        <w:rPr>
+          <w:rFonts w:eastAsia="Times New Roman" w:cstheme="minorHAnsi"/>
+        </w:rPr>
+        <w:t>Course Overview</w:t>
+      </w:r>
+    </w:p>
+    <w:p>
+      <w:pPr>
+        <w:pStyle w:val="ListParagraph"/>
+        <w:numPr>
+          <w:ilvl w:val="1"/>
+          <w:numId w:val="4"/>
+        </w:numPr>
+        <w:rPr>
+          <w:rFonts w:cstheme="minorHAnsi"/>
+        </w:rPr>
+      </w:pPr>
+      <w:r>
+        <w:rPr>
+          <w:rFonts w:eastAsia="Times New Roman" w:cstheme="minorHAnsi"/>
+        </w:rPr>
+        <w:t>One paragraph overview of what the course is about</w:t>
+      </w:r>
+    </w:p>
+    <w:p>
+      <w:pPr>
+        <w:rPr>
+          <w:rFonts w:cstheme="minorHAnsi"/>
+        </w:rPr>
+      </w:pPr>
+    </w:p>
+    <w:p>
+      <w:pPr>
+        <w:pStyle w:val="Heading1"/>
+      </w:pPr>
+      <w:r>
+        <w:t>How this course works</w:t>
+      </w:r>
+    </w:p>
+    <w:p/>
+    <w:p>
+      <w:pPr>
+        <w:pStyle w:val="ListParagraph"/>
+        <w:numPr>
+          <w:ilvl w:val="0"/>
+          <w:numId w:val="4"/>
+        </w:numPr>
+        <w:rPr>
+          <w:rFonts w:cstheme="minorHAnsi"/>
+        </w:rPr>
+      </w:pPr>
+      <w:r>
+        <w:rPr>
+          <w:rFonts w:cstheme="minorHAnsi"/>
+        </w:rPr>
+        <w:t>First two paragraphs are generic</w:t>
+      </w:r>
+    </w:p>
+    <w:p>
+      <w:pPr>
+        <w:pStyle w:val="ListParagraph"/>
+        <w:numPr>
+          <w:ilvl w:val="0"/>
+          <w:numId w:val="4"/>
+        </w:numPr>
+        <w:rPr>
+          <w:rFonts w:cstheme="minorHAnsi"/>
+          <w:i/>
+        </w:rPr>
+      </w:pPr>
+      <w:r>
+        <w:rPr>
+          <w:rFonts w:cstheme="minorHAnsi"/>
+          <w:i/>
+        </w:rPr>
+        <w:lastRenderedPageBreak/>
+        <w:t>“Working through the course”</w:t>
+      </w:r>
+    </w:p>
+    <w:p>
+      <w:pPr>
+        <w:pStyle w:val="ListParagraph"/>
+        <w:numPr>
+          <w:ilvl w:val="1"/>
+          <w:numId w:val="4"/>
+        </w:numPr>
+        <w:rPr>
+          <w:rFonts w:cstheme="minorHAnsi"/>
+        </w:rPr>
+      </w:pPr>
+      <w:r>
+        <w:rPr>
+          <w:rFonts w:cstheme="minorHAnsi"/>
+        </w:rPr>
+        <w:t>A</w:t>
+      </w:r>
+      <w:r>
+        <w:rPr>
+          <w:rFonts w:cstheme="minorHAnsi"/>
+        </w:rPr>
+        <w:t>ll of this is generic</w:t>
+      </w:r>
+      <w:r>
+        <w:rPr>
+          <w:rFonts w:cstheme="minorHAnsi"/>
+        </w:rPr>
+        <w:t xml:space="preserve"> and should be in every course</w:t>
+      </w:r>
+    </w:p>
+    <w:p>
+      <w:pPr>
+        <w:pStyle w:val="ListParagraph"/>
+        <w:numPr>
+          <w:ilvl w:val="1"/>
+          <w:numId w:val="4"/>
+        </w:numPr>
+        <w:rPr>
+          <w:rFonts w:cstheme="minorHAnsi"/>
+        </w:rPr>
+      </w:pPr>
+      <w:r>
+        <w:rPr>
+          <w:rFonts w:cstheme="minorHAnsi"/>
+        </w:rPr>
+        <w:t>If for some reason there’s something different in your course, it would have to be updated</w:t>
+      </w:r>
+    </w:p>
+    <w:p>
+      <w:pPr>
+        <w:rPr>
+          <w:rFonts w:cstheme="minorHAnsi"/>
+        </w:rPr>
+      </w:pPr>
+    </w:p>
+    <w:p>
+      <w:pPr>
+        <w:pStyle w:val="ListParagraph"/>
+        <w:numPr>
+          <w:ilvl w:val="0"/>
+          <w:numId w:val="4"/>
+        </w:numPr>
+        <w:rPr>
+          <w:rFonts w:cstheme="minorHAnsi"/>
+          <w:i/>
+        </w:rPr>
+      </w:pPr>
+      <w:r>
+        <w:rPr>
+          <w:rFonts w:cstheme="minorHAnsi"/>
+          <w:i/>
+        </w:rPr>
+        <w:t>“Course structure”</w:t>
+      </w:r>
+    </w:p>
+    <w:p>
+      <w:pPr>
+        <w:pStyle w:val="ListParagraph"/>
+        <w:numPr>
+          <w:ilvl w:val="1"/>
+          <w:numId w:val="4"/>
+        </w:numPr>
+        <w:rPr>
+          <w:rFonts w:cstheme="minorHAnsi"/>
+        </w:rPr>
+      </w:pPr>
+      <w:r>
+        <w:rPr>
+          <w:rFonts w:cstheme="minorHAnsi"/>
+        </w:rPr>
+        <w:t>I</w:t>
+      </w:r>
+      <w:r>
+        <w:rPr>
+          <w:rFonts w:cstheme="minorHAnsi"/>
+        </w:rPr>
+        <w:t>s the non-generic part</w:t>
+      </w:r>
+    </w:p>
+    <w:p>
+      <w:pPr>
+        <w:pStyle w:val="ListParagraph"/>
+        <w:numPr>
+          <w:ilvl w:val="1"/>
+          <w:numId w:val="4"/>
+        </w:numPr>
+        <w:rPr>
+          <w:rFonts w:cstheme="minorHAnsi"/>
+        </w:rPr>
+      </w:pPr>
+      <w:r>
+        <w:rPr>
+          <w:rFonts w:cstheme="minorHAnsi"/>
+        </w:rPr>
+        <w:t>F</w:t>
+      </w:r>
+      <w:r>
+        <w:rPr>
+          <w:rFonts w:cstheme="minorHAnsi"/>
+        </w:rPr>
+        <w:t xml:space="preserve">ollows model of </w:t>
+      </w:r>
+      <w:r>
+        <w:rPr>
+          <w:rFonts w:cstheme="minorHAnsi"/>
+        </w:rPr>
+        <w:t>other courses</w:t>
+      </w:r>
+      <w:r>
+        <w:rPr>
+          <w:rFonts w:cstheme="minorHAnsi"/>
+        </w:rPr>
+        <w:t>, with actual module names</w:t>
+      </w:r>
+    </w:p>
+    <w:p>
+      <w:pPr>
+        <w:rPr>
+          <w:rFonts w:cstheme="minorHAnsi"/>
+        </w:rPr>
+      </w:pPr>
+    </w:p>
+    <w:p>
+      <w:pPr>
+        <w:pStyle w:val="Heading1"/>
+      </w:pPr>
+      <w:r>
+        <w:t>Course activities</w:t>
+      </w:r>
+    </w:p>
+    <w:p/>
+    <w:p>
+      <w:pPr>
+        <w:pStyle w:val="ListParagraph"/>
+        <w:numPr>
+          <w:ilvl w:val="0"/>
+          <w:numId w:val="4"/>
+        </w:numPr>
+        <w:rPr>
+          <w:rFonts w:cstheme="minorHAnsi"/>
+        </w:rPr>
+      </w:pPr>
+      <w:r>
+        <w:rPr>
+          <w:rFonts w:cstheme="minorHAnsi"/>
+        </w:rPr>
+        <w:t>All  content is generic and should be included with the possible exception of discussion info</w:t>
+      </w:r>
+    </w:p>
+    <w:p>
+      <w:pPr>
+        <w:pStyle w:val="ListParagraph"/>
+        <w:numPr>
+          <w:ilvl w:val="0"/>
+          <w:numId w:val="4"/>
+        </w:numPr>
+        <w:rPr>
+          <w:rFonts w:cstheme="minorHAnsi"/>
+        </w:rPr>
+      </w:pPr>
+      <w:r>
+        <w:rPr>
+          <w:rFonts w:cstheme="minorHAnsi"/>
+        </w:rPr>
+        <w:t>Decisions about when discussions are available and for how long are part of the individual course design, so this should b</w:t>
+      </w:r>
+      <w:r>
+        <w:rPr>
+          <w:rFonts w:cstheme="minorHAnsi"/>
+        </w:rPr>
+        <w:t>e reviewed for each new course</w:t>
+      </w:r>
+    </w:p>
+    <w:p>
+      <w:pPr>
+        <w:pStyle w:val="ListParagraph"/>
+        <w:numPr>
+          <w:ilvl w:val="1"/>
+          <w:numId w:val="4"/>
+        </w:numPr>
+        <w:rPr>
+          <w:rFonts w:cstheme="minorHAnsi"/>
+        </w:rPr>
+      </w:pPr>
+      <w:r>
+        <w:rPr>
+          <w:rFonts w:cstheme="minorHAnsi"/>
+        </w:rPr>
+        <w:t>There should be instructions for the discussion</w:t>
+      </w:r>
+      <w:r>
+        <w:rPr>
+          <w:rFonts w:cstheme="minorHAnsi"/>
+        </w:rPr>
+        <w:t xml:space="preserve"> provided on this page</w:t>
+      </w:r>
+    </w:p>
+    <w:p>
+      <w:pPr>
+        <w:rPr>
+          <w:rFonts w:cstheme="minorHAnsi"/>
+          <w:b/>
+        </w:rPr>
+      </w:pPr>
+    </w:p>
+    <w:p>
+      <w:pPr>
+        <w:pStyle w:val="Heading1"/>
+      </w:pPr>
+      <w:r>
+        <w:t>Assessment</w:t>
+      </w:r>
+    </w:p>
+    <w:p/>
+    <w:p>
+      <w:pPr>
+        <w:pStyle w:val="ListParagraph"/>
+        <w:numPr>
+          <w:ilvl w:val="0"/>
+          <w:numId w:val="4"/>
+        </w:numPr>
+        <w:rPr>
+          <w:rFonts w:cstheme="minorHAnsi"/>
+        </w:rPr>
+      </w:pPr>
+      <w:r>
+        <w:rPr>
+          <w:rFonts w:cstheme="minorHAnsi"/>
+        </w:rPr>
+        <w:t>Courses should include:</w:t>
+      </w:r>
+    </w:p>
+    <w:p>
+      <w:pPr>
+        <w:pStyle w:val="ListParagraph"/>
+        <w:numPr>
+          <w:ilvl w:val="1"/>
+          <w:numId w:val="4"/>
+        </w:numPr>
+        <w:rPr>
+          <w:rFonts w:cstheme="minorHAnsi"/>
+        </w:rPr>
+      </w:pPr>
+      <w:r>
+        <w:rPr>
+          <w:rFonts w:cstheme="minorHAnsi"/>
+        </w:rPr>
+        <w:t xml:space="preserve">Two assignments to be submitted via </w:t>
+      </w:r>
+      <w:r>
+        <w:rPr>
+          <w:rFonts w:cstheme="minorHAnsi"/>
+        </w:rPr>
+        <w:t xml:space="preserve">the Assignment </w:t>
+      </w:r>
+      <w:proofErr w:type="spellStart"/>
+      <w:r>
+        <w:rPr>
+          <w:rFonts w:cstheme="minorHAnsi"/>
+        </w:rPr>
+        <w:t>dropbox</w:t>
+      </w:r>
+      <w:proofErr w:type="spellEnd"/>
+    </w:p>
+    <w:p>
+      <w:pPr>
+        <w:pStyle w:val="ListParagraph"/>
+        <w:numPr>
+          <w:ilvl w:val="1"/>
+          <w:numId w:val="4"/>
+        </w:numPr>
+        <w:rPr>
+          <w:rFonts w:cstheme="minorHAnsi"/>
+        </w:rPr>
+      </w:pPr>
+      <w:r>
+        <w:rPr>
+          <w:rFonts w:cstheme="minorHAnsi"/>
+        </w:rPr>
+        <w:t>A midterm exam</w:t>
+      </w:r>
+    </w:p>
+    <w:p>
+      <w:pPr>
+        <w:pStyle w:val="ListParagraph"/>
+        <w:numPr>
+          <w:ilvl w:val="1"/>
+          <w:numId w:val="4"/>
+        </w:numPr>
+        <w:rPr>
+          <w:rFonts w:cstheme="minorHAnsi"/>
+        </w:rPr>
+      </w:pPr>
+      <w:r>
+        <w:rPr>
+          <w:rFonts w:cstheme="minorHAnsi"/>
+        </w:rPr>
+        <w:t>A final exam</w:t>
+      </w:r>
+    </w:p>
+    <w:p>
+      <w:pPr>
+        <w:pStyle w:val="ListParagraph"/>
+        <w:numPr>
+          <w:ilvl w:val="1"/>
+          <w:numId w:val="4"/>
+        </w:numPr>
+        <w:rPr>
+          <w:rFonts w:cstheme="minorHAnsi"/>
+        </w:rPr>
+      </w:pPr>
+      <w:r>
+        <w:rPr>
+          <w:rFonts w:cstheme="minorHAnsi"/>
+        </w:rPr>
+        <w:t>Self-tests at the</w:t>
+      </w:r>
+      <w:r>
+        <w:rPr>
+          <w:rFonts w:cstheme="minorHAnsi"/>
+        </w:rPr>
+        <w:t xml:space="preserve"> end of each module for review</w:t>
+      </w:r>
+    </w:p>
+    <w:p>
+      <w:pPr>
+        <w:pStyle w:val="ListParagraph"/>
+        <w:numPr>
+          <w:ilvl w:val="2"/>
+          <w:numId w:val="4"/>
+        </w:numPr>
+        <w:rPr>
+          <w:rFonts w:cstheme="minorHAnsi"/>
+        </w:rPr>
+      </w:pPr>
+      <w:r>
+        <w:rPr>
+          <w:rFonts w:cstheme="minorHAnsi"/>
+        </w:rPr>
+        <w:t>these do not contribute to the marks</w:t>
+      </w:r>
+    </w:p>
+    <w:p>
+      <w:pPr>
+        <w:rPr>
+          <w:rFonts w:cstheme="minorHAnsi"/>
+        </w:rPr>
+      </w:pPr>
+    </w:p>
+    <w:p>
+      <w:pPr>
+        <w:pStyle w:val="ListParagraph"/>
+        <w:numPr>
+          <w:ilvl w:val="0"/>
+          <w:numId w:val="4"/>
+        </w:numPr>
+        <w:rPr>
+          <w:rFonts w:cstheme="minorHAnsi"/>
+        </w:rPr>
+      </w:pPr>
+      <w:r>
+        <w:rPr>
+          <w:rFonts w:cstheme="minorHAnsi"/>
+        </w:rPr>
+        <w:t>Assignments</w:t>
+      </w:r>
+    </w:p>
+    <w:p>
+      <w:pPr>
+        <w:pStyle w:val="ListParagraph"/>
+        <w:numPr>
+          <w:ilvl w:val="1"/>
+          <w:numId w:val="4"/>
+        </w:numPr>
+        <w:rPr>
+          <w:rFonts w:cstheme="minorHAnsi"/>
+        </w:rPr>
+      </w:pPr>
+      <w:r>
+        <w:rPr>
+          <w:rFonts w:cstheme="minorHAnsi"/>
+        </w:rPr>
+        <w:t>Each assignment should have a descriptive page in this assessment section</w:t>
+      </w:r>
+    </w:p>
+    <w:p>
+      <w:pPr>
+        <w:pStyle w:val="ListParagraph"/>
+        <w:numPr>
+          <w:ilvl w:val="1"/>
+          <w:numId w:val="4"/>
+        </w:numPr>
+        <w:rPr>
+          <w:rFonts w:cstheme="minorHAnsi"/>
+        </w:rPr>
+      </w:pPr>
+      <w:r>
+        <w:rPr>
+          <w:rFonts w:cstheme="minorHAnsi"/>
+        </w:rPr>
+        <w:t>The page:</w:t>
+      </w:r>
+    </w:p>
+    <w:p>
+      <w:pPr>
+        <w:pStyle w:val="ListParagraph"/>
+        <w:numPr>
+          <w:ilvl w:val="2"/>
+          <w:numId w:val="4"/>
+        </w:numPr>
+        <w:rPr>
+          <w:rFonts w:cstheme="minorHAnsi"/>
+        </w:rPr>
+      </w:pPr>
+      <w:r>
+        <w:rPr>
+          <w:rFonts w:cstheme="minorHAnsi"/>
+        </w:rPr>
+        <w:t>Gives an overview of the assignment</w:t>
+      </w:r>
+    </w:p>
+    <w:p>
+      <w:pPr>
+        <w:pStyle w:val="ListParagraph"/>
+        <w:numPr>
+          <w:ilvl w:val="2"/>
+          <w:numId w:val="4"/>
+        </w:numPr>
+        <w:rPr>
+          <w:rFonts w:cstheme="minorHAnsi"/>
+        </w:rPr>
+      </w:pPr>
+      <w:r>
+        <w:rPr>
+          <w:rFonts w:cstheme="minorHAnsi"/>
+        </w:rPr>
+        <w:t>Identify appropriate/expected length and format</w:t>
+      </w:r>
+    </w:p>
+    <w:p>
+      <w:pPr>
+        <w:pStyle w:val="ListParagraph"/>
+        <w:numPr>
+          <w:ilvl w:val="2"/>
+          <w:numId w:val="4"/>
+        </w:numPr>
+        <w:rPr>
+          <w:rFonts w:cstheme="minorHAnsi"/>
+        </w:rPr>
+      </w:pPr>
+      <w:r>
+        <w:rPr>
+          <w:rFonts w:cstheme="minorHAnsi"/>
+        </w:rPr>
+        <w:t>Indicate readings or other materials that must be consulted</w:t>
+      </w:r>
+    </w:p>
+    <w:p>
+      <w:pPr>
+        <w:pStyle w:val="ListParagraph"/>
+        <w:numPr>
+          <w:ilvl w:val="2"/>
+          <w:numId w:val="4"/>
+        </w:numPr>
+        <w:rPr>
+          <w:rFonts w:cstheme="minorHAnsi"/>
+        </w:rPr>
+      </w:pPr>
+      <w:r>
+        <w:rPr>
+          <w:rFonts w:cstheme="minorHAnsi"/>
+        </w:rPr>
+        <w:t>May describe the completed assignment in more detail if appropriate for the course</w:t>
+      </w:r>
+    </w:p>
+    <w:p>
+      <w:pPr>
+        <w:pStyle w:val="ListParagraph"/>
+        <w:numPr>
+          <w:ilvl w:val="2"/>
+          <w:numId w:val="4"/>
+        </w:numPr>
+        <w:rPr>
+          <w:rFonts w:cstheme="minorHAnsi"/>
+        </w:rPr>
+      </w:pPr>
+      <w:r>
+        <w:rPr>
+          <w:rFonts w:cstheme="minorHAnsi"/>
+        </w:rPr>
+        <w:t>Should include a link to marking criteria or a rubric or marking guide for student reference</w:t>
+      </w:r>
+    </w:p>
+    <w:p>
+      <w:pPr>
+        <w:pStyle w:val="ListParagraph"/>
+        <w:numPr>
+          <w:ilvl w:val="2"/>
+          <w:numId w:val="4"/>
+        </w:numPr>
+        <w:rPr>
+          <w:rFonts w:cstheme="minorHAnsi"/>
+        </w:rPr>
+      </w:pPr>
+      <w:r>
+        <w:rPr>
+          <w:rFonts w:cstheme="minorHAnsi"/>
+        </w:rPr>
+        <w:t xml:space="preserve">Include link to </w:t>
+      </w:r>
+      <w:proofErr w:type="spellStart"/>
+      <w:r>
+        <w:rPr>
+          <w:rFonts w:cstheme="minorHAnsi"/>
+        </w:rPr>
+        <w:t>dropbox</w:t>
+      </w:r>
+      <w:proofErr w:type="spellEnd"/>
+      <w:r>
+        <w:rPr>
+          <w:rFonts w:cstheme="minorHAnsi"/>
+        </w:rPr>
+        <w:t xml:space="preserve">, </w:t>
+      </w:r>
+      <w:r>
+        <w:rPr>
+          <w:rFonts w:cstheme="minorHAnsi"/>
+          <w:i/>
+        </w:rPr>
+        <w:t xml:space="preserve">AND </w:t>
+      </w:r>
+      <w:r>
+        <w:rPr>
+          <w:rFonts w:cstheme="minorHAnsi"/>
+        </w:rPr>
+        <w:t xml:space="preserve">due date of assignment (generically – </w:t>
+      </w:r>
+      <w:proofErr w:type="spellStart"/>
+      <w:r>
+        <w:rPr>
+          <w:rFonts w:cstheme="minorHAnsi"/>
+        </w:rPr>
+        <w:t>ie</w:t>
+      </w:r>
+      <w:proofErr w:type="spellEnd"/>
+      <w:r>
+        <w:rPr>
+          <w:rFonts w:cstheme="minorHAnsi"/>
+        </w:rPr>
+        <w:t xml:space="preserve"> end of week 6)</w:t>
+      </w:r>
+    </w:p>
+    <w:p>
+      <w:pPr>
+        <w:rPr>
+          <w:rFonts w:cstheme="minorHAnsi"/>
+        </w:rPr>
+      </w:pPr>
+    </w:p>
+    <w:p>
+      <w:pPr>
+        <w:pStyle w:val="ListParagraph"/>
+        <w:numPr>
+          <w:ilvl w:val="1"/>
+          <w:numId w:val="4"/>
+        </w:numPr>
+        <w:rPr>
+          <w:rFonts w:cstheme="minorHAnsi"/>
+        </w:rPr>
+      </w:pPr>
+      <w:r>
+        <w:rPr>
+          <w:rFonts w:cstheme="minorHAnsi"/>
+        </w:rPr>
+        <w:t xml:space="preserve">Midterm and final exams </w:t>
+      </w:r>
+    </w:p>
+    <w:p>
+      <w:pPr>
+        <w:pStyle w:val="ListParagraph"/>
+        <w:numPr>
+          <w:ilvl w:val="2"/>
+          <w:numId w:val="4"/>
+        </w:numPr>
+        <w:rPr>
+          <w:rFonts w:cstheme="minorHAnsi"/>
+        </w:rPr>
+      </w:pPr>
+      <w:r>
+        <w:rPr>
+          <w:rFonts w:cstheme="minorHAnsi"/>
+        </w:rPr>
+        <w:t>This generic page should be included in all courses</w:t>
+      </w:r>
+    </w:p>
+    <w:p>
+      <w:pPr>
+        <w:rPr>
+          <w:rFonts w:cstheme="minorHAnsi"/>
+        </w:rPr>
+      </w:pPr>
+    </w:p>
+    <w:p>
+      <w:pPr>
+        <w:pStyle w:val="ListParagraph"/>
+        <w:numPr>
+          <w:ilvl w:val="1"/>
+          <w:numId w:val="4"/>
+        </w:numPr>
+        <w:rPr>
+          <w:rFonts w:cstheme="minorHAnsi"/>
+        </w:rPr>
+      </w:pPr>
+      <w:r>
+        <w:rPr>
+          <w:rFonts w:cstheme="minorHAnsi"/>
+        </w:rPr>
+        <w:t>Sample exam</w:t>
+      </w:r>
+    </w:p>
+    <w:p>
+      <w:pPr>
+        <w:pStyle w:val="ListParagraph"/>
+        <w:numPr>
+          <w:ilvl w:val="2"/>
+          <w:numId w:val="4"/>
+        </w:numPr>
+        <w:rPr>
+          <w:rFonts w:cstheme="minorHAnsi"/>
+        </w:rPr>
+      </w:pPr>
+      <w:r>
+        <w:rPr>
+          <w:rFonts w:cstheme="minorHAnsi"/>
+        </w:rPr>
+        <w:t>Generic, include in all courses</w:t>
+      </w:r>
+    </w:p>
+    <w:p>
+      <w:pPr>
+        <w:rPr>
+          <w:rFonts w:cstheme="minorHAnsi"/>
+        </w:rPr>
+      </w:pPr>
+    </w:p>
+    <w:p>
+      <w:pPr>
+        <w:pStyle w:val="Heading1"/>
+      </w:pPr>
+      <w:r>
+        <w:t>Academic Conduct</w:t>
+      </w:r>
+    </w:p>
+    <w:p/>
+    <w:p>
+      <w:pPr>
+        <w:pStyle w:val="ListParagraph"/>
+        <w:numPr>
+          <w:ilvl w:val="0"/>
+          <w:numId w:val="4"/>
+        </w:numPr>
+        <w:rPr>
+          <w:rFonts w:cstheme="minorHAnsi"/>
+        </w:rPr>
+      </w:pPr>
+      <w:r>
+        <w:rPr>
+          <w:rFonts w:cstheme="minorHAnsi"/>
+        </w:rPr>
+        <w:t>Generic, include in all courses</w:t>
+      </w:r>
+    </w:p>
+    <w:p>
+      <w:pPr>
+        <w:rPr>
+          <w:rFonts w:cstheme="minorHAnsi"/>
+        </w:rPr>
+      </w:pPr>
+    </w:p>
+    <w:p>
+      <w:pPr>
+        <w:pStyle w:val="Heading1"/>
+      </w:pPr>
+      <w:r>
+        <w:t>Student Profile</w:t>
+      </w:r>
+    </w:p>
+    <w:p/>
+    <w:p>
+      <w:pPr>
+        <w:pStyle w:val="ListParagraph"/>
+        <w:numPr>
+          <w:ilvl w:val="0"/>
+          <w:numId w:val="4"/>
+        </w:numPr>
+        <w:rPr>
+          <w:rFonts w:cstheme="minorHAnsi"/>
+        </w:rPr>
+      </w:pPr>
+      <w:r>
+        <w:rPr>
+          <w:rFonts w:cstheme="minorHAnsi"/>
+        </w:rPr>
+        <w:t>Generic, include in all courses</w:t>
+      </w:r>
+    </w:p>
+    <w:p>
+      <w:pPr>
+        <w:rPr>
+          <w:rFonts w:cstheme="minorHAnsi"/>
+        </w:rPr>
+      </w:pPr>
+    </w:p>
+    <w:p>
+      <w:pPr>
+        <w:pStyle w:val="Heading1"/>
+      </w:pPr>
+      <w:r>
+        <w:t>Welcome</w:t>
+      </w:r>
+    </w:p>
+    <w:p/>
+    <w:p>
+      <w:pPr>
+        <w:pStyle w:val="ListParagraph"/>
+        <w:numPr>
+          <w:ilvl w:val="0"/>
+          <w:numId w:val="4"/>
+        </w:numPr>
+        <w:rPr>
+          <w:rFonts w:cstheme="minorHAnsi"/>
+        </w:rPr>
+      </w:pPr>
+      <w:r>
+        <w:rPr>
+          <w:rFonts w:cstheme="minorHAnsi"/>
+        </w:rPr>
+        <w:t>Each course should incl</w:t>
+      </w:r>
+      <w:r>
+        <w:rPr>
+          <w:rFonts w:cstheme="minorHAnsi"/>
+        </w:rPr>
+        <w:t>ude a Welcome discussion topic</w:t>
+      </w:r>
+    </w:p>
+    <w:p>
+      <w:pPr>
+        <w:pStyle w:val="ListParagraph"/>
+        <w:numPr>
+          <w:ilvl w:val="0"/>
+          <w:numId w:val="4"/>
+        </w:numPr>
+        <w:rPr>
+          <w:rFonts w:cstheme="minorHAnsi"/>
+        </w:rPr>
+      </w:pPr>
+      <w:r>
+        <w:rPr>
+          <w:rFonts w:cstheme="minorHAnsi"/>
+        </w:rPr>
+        <w:t>Content</w:t>
+      </w:r>
+      <w:r>
+        <w:rPr>
+          <w:rFonts w:cstheme="minorHAnsi"/>
+        </w:rPr>
+        <w:t xml:space="preserve"> can be the same as in other courses</w:t>
+      </w:r>
+    </w:p>
+    <w:p>
+      <w:pPr>
+        <w:rPr>
+          <w:rFonts w:cstheme="minorHAnsi"/>
+        </w:rPr>
+      </w:pPr>
+    </w:p>
+    <w:p>
+      <w:pPr>
+        <w:pStyle w:val="Heading1"/>
+      </w:pPr>
+      <w:r>
+        <w:t>Q&amp;A</w:t>
+      </w:r>
+    </w:p>
+    <w:p/>
+    <w:p>
+      <w:pPr>
+        <w:pStyle w:val="ListParagraph"/>
+        <w:numPr>
+          <w:ilvl w:val="0"/>
+          <w:numId w:val="4"/>
+        </w:numPr>
+        <w:rPr>
+          <w:rFonts w:cstheme="minorHAnsi"/>
+        </w:rPr>
+      </w:pPr>
+      <w:r>
+        <w:rPr>
+          <w:rFonts w:cstheme="minorHAnsi"/>
+        </w:rPr>
+        <w:t>Each course should have a Q&amp;A discussion topic, linked from here</w:t>
+      </w:r>
+    </w:p>
+    <w:p>
+      <w:pPr>
+        <w:pStyle w:val="ListParagraph"/>
+        <w:numPr>
+          <w:ilvl w:val="0"/>
+          <w:numId w:val="4"/>
+        </w:numPr>
+        <w:rPr>
+          <w:rFonts w:cstheme="minorHAnsi"/>
+        </w:rPr>
+      </w:pPr>
+      <w:r>
+        <w:rPr>
+          <w:rFonts w:cstheme="minorHAnsi"/>
+        </w:rPr>
+        <w:t>Text for intro:</w:t>
+      </w:r>
+    </w:p>
+    <w:p>
+      <w:pPr>
+        <w:pStyle w:val="Quote"/>
+      </w:pPr>
+      <w:r>
+        <w:t>“</w:t>
+      </w:r>
+      <w:r>
+        <w:t>Post any questions you may have about the course here. Feel free to answer your peers' questions as well, if you have the answer. Don't be shy and ask away! Enjoy your study of this course.</w:t>
+      </w:r>
+      <w:r>
+        <w:t>”</w:t>
+      </w:r>
+    </w:p>
+    <w:p>
+      <w:pPr>
+        <w:rPr>
+          <w:rFonts w:cstheme="minorHAnsi"/>
+          <w:b/>
+        </w:rPr>
+      </w:pPr>
+    </w:p>
+    <w:p/>
+    <w:p>
+      <w:pPr>
+        <w:pStyle w:val="Title"/>
+      </w:pPr>
+      <w:r>
+        <w:t>Module 2</w:t>
+      </w:r>
+    </w:p>
+    <w:p>
+      <w:pPr>
+        <w:rPr>
+          <w:rFonts w:cstheme="minorHAnsi"/>
+          <w:b/>
+        </w:rPr>
+      </w:pPr>
+    </w:p>
+    <w:p>
+      <w:pPr>
+        <w:pStyle w:val="Heading1"/>
+      </w:pPr>
+      <w:r>
+        <w:t>Introduction</w:t>
+      </w:r>
+    </w:p>
+    <w:p>
+      <w:pPr>
+        <w:rPr>
+          <w:rFonts w:cstheme="minorHAnsi"/>
+          <w:b/>
+        </w:rPr>
+      </w:pPr>
+    </w:p>
+    <w:p>
+      <w:pPr>
+        <w:pStyle w:val="ListParagraph"/>
+        <w:numPr>
+          <w:ilvl w:val="0"/>
+          <w:numId w:val="4"/>
+        </w:numPr>
+        <w:rPr>
+          <w:rFonts w:cstheme="minorHAnsi"/>
+        </w:rPr>
+      </w:pPr>
+      <w:r>
+        <w:rPr>
+          <w:rFonts w:cstheme="minorHAnsi"/>
+        </w:rPr>
+        <w:t>Video plus transcript only</w:t>
+      </w:r>
+    </w:p>
+    <w:p>
+      <w:pPr>
+        <w:pStyle w:val="ListParagraph"/>
+        <w:numPr>
+          <w:ilvl w:val="0"/>
+          <w:numId w:val="4"/>
+        </w:numPr>
+        <w:rPr>
+          <w:rFonts w:cstheme="minorHAnsi"/>
+        </w:rPr>
+      </w:pPr>
+      <w:r>
+        <w:rPr>
+          <w:rFonts w:cstheme="minorHAnsi"/>
+        </w:rPr>
+        <w:t>Done the same way as the course overview video and transcript in Module 0</w:t>
+      </w:r>
+    </w:p>
+    <w:p>
+      <w:pPr>
+        <w:rPr>
+          <w:rFonts w:cstheme="minorHAnsi"/>
+        </w:rPr>
+      </w:pPr>
+    </w:p>
+    <w:p>
+      <w:pPr>
+        <w:pStyle w:val="Heading1"/>
+      </w:pPr>
+      <w:r>
+        <w:lastRenderedPageBreak/>
+        <w:t>Learning objectives</w:t>
+      </w:r>
+    </w:p>
+    <w:p>
+      <w:pPr>
+        <w:rPr>
+          <w:rFonts w:cstheme="minorHAnsi"/>
+          <w:b/>
+        </w:rPr>
+      </w:pPr>
+    </w:p>
+    <w:p>
+      <w:pPr>
+        <w:pStyle w:val="ListParagraph"/>
+        <w:numPr>
+          <w:ilvl w:val="0"/>
+          <w:numId w:val="4"/>
+        </w:numPr>
+        <w:rPr>
+          <w:rFonts w:cstheme="minorHAnsi"/>
+        </w:rPr>
+      </w:pPr>
+      <w:r>
+        <w:rPr>
+          <w:rFonts w:cstheme="minorHAnsi"/>
+        </w:rPr>
+        <w:t xml:space="preserve">Page </w:t>
+      </w:r>
+      <w:r>
+        <w:rPr>
+          <w:rFonts w:cstheme="minorHAnsi"/>
+        </w:rPr>
+        <w:t xml:space="preserve">Title = </w:t>
+      </w:r>
+      <w:r>
+        <w:rPr>
+          <w:rFonts w:cstheme="minorHAnsi"/>
+          <w:i/>
+        </w:rPr>
+        <w:t>“</w:t>
+      </w:r>
+      <w:r>
+        <w:rPr>
+          <w:rFonts w:cstheme="minorHAnsi"/>
+          <w:i/>
+        </w:rPr>
+        <w:t>Learning Objectives</w:t>
+      </w:r>
+      <w:r>
+        <w:rPr>
+          <w:rFonts w:cstheme="minorHAnsi"/>
+          <w:i/>
+        </w:rPr>
+        <w:t>”</w:t>
+      </w:r>
+    </w:p>
+    <w:p>
+      <w:pPr>
+        <w:pStyle w:val="ListParagraph"/>
+        <w:numPr>
+          <w:ilvl w:val="0"/>
+          <w:numId w:val="4"/>
+        </w:numPr>
+        <w:rPr>
+          <w:rFonts w:cstheme="minorHAnsi"/>
+          <w:i/>
+        </w:rPr>
+      </w:pPr>
+      <w:r>
+        <w:rPr>
+          <w:rFonts w:cstheme="minorHAnsi"/>
+          <w:i/>
+        </w:rPr>
+        <w:t>“</w:t>
+      </w:r>
+      <w:r>
+        <w:rPr>
+          <w:rFonts w:cstheme="minorHAnsi"/>
+          <w:i/>
+        </w:rPr>
+        <w:t>Outcomes</w:t>
+      </w:r>
+      <w:r>
+        <w:rPr>
+          <w:rFonts w:cstheme="minorHAnsi"/>
+          <w:i/>
+        </w:rPr>
+        <w:t>”</w:t>
+      </w:r>
+    </w:p>
+    <w:p>
+      <w:pPr>
+        <w:pStyle w:val="ListParagraph"/>
+        <w:numPr>
+          <w:ilvl w:val="1"/>
+          <w:numId w:val="4"/>
+        </w:numPr>
+        <w:rPr>
+          <w:rFonts w:cstheme="minorHAnsi"/>
+        </w:rPr>
+      </w:pPr>
+      <w:r>
+        <w:rPr>
+          <w:rFonts w:cstheme="minorHAnsi"/>
+        </w:rPr>
+        <w:t>In #outcomes box with floating icon</w:t>
+      </w:r>
+    </w:p>
+    <w:p>
+      <w:pPr>
+        <w:rPr>
+          <w:rFonts w:cstheme="minorHAnsi"/>
+        </w:rPr>
+      </w:pPr>
+    </w:p>
+    <w:p>
+      <w:pPr>
+        <w:pStyle w:val="Heading1"/>
+      </w:pPr>
+      <w:r>
+        <w:t>Content</w:t>
+      </w:r>
+    </w:p>
+    <w:p>
+      <w:pPr>
+        <w:rPr>
+          <w:rFonts w:cstheme="minorHAnsi"/>
+          <w:b/>
+        </w:rPr>
+      </w:pPr>
+    </w:p>
+    <w:p>
+      <w:pPr>
+        <w:pStyle w:val="ListParagraph"/>
+        <w:numPr>
+          <w:ilvl w:val="0"/>
+          <w:numId w:val="4"/>
+        </w:numPr>
+        <w:rPr>
+          <w:rFonts w:cstheme="minorHAnsi"/>
+        </w:rPr>
+      </w:pPr>
+      <w:r>
+        <w:rPr>
+          <w:rFonts w:cstheme="minorHAnsi"/>
+        </w:rPr>
+        <w:t>Ideally should be divided into sub-modules</w:t>
+      </w:r>
+      <w:r>
+        <w:rPr>
+          <w:rFonts w:cstheme="minorHAnsi"/>
+        </w:rPr>
+        <w:t xml:space="preserve"> </w:t>
+      </w:r>
+    </w:p>
+    <w:p>
+      <w:pPr>
+        <w:pStyle w:val="ListParagraph"/>
+        <w:numPr>
+          <w:ilvl w:val="0"/>
+          <w:numId w:val="4"/>
+        </w:numPr>
+        <w:rPr>
+          <w:rFonts w:cstheme="minorHAnsi"/>
+        </w:rPr>
+      </w:pPr>
+      <w:r>
+        <w:rPr>
+          <w:rFonts w:cstheme="minorHAnsi"/>
+        </w:rPr>
+        <w:t>Learning activities should be used wherever possible to replace blocks of text</w:t>
+      </w:r>
+    </w:p>
+    <w:p>
+      <w:pPr>
+        <w:pStyle w:val="ListParagraph"/>
+        <w:numPr>
+          <w:ilvl w:val="0"/>
+          <w:numId w:val="4"/>
+        </w:numPr>
+        <w:rPr>
+          <w:rFonts w:cstheme="minorHAnsi"/>
+        </w:rPr>
+      </w:pPr>
+      <w:r>
+        <w:rPr>
+          <w:rFonts w:cstheme="minorHAnsi"/>
+        </w:rPr>
+        <w:t xml:space="preserve">Pages within sub-modules should ideally be </w:t>
+      </w:r>
+      <w:r>
+        <w:rPr>
+          <w:rFonts w:cstheme="minorHAnsi"/>
+        </w:rPr>
+        <w:t>1-2 pages in length</w:t>
+      </w:r>
+    </w:p>
+    <w:p>
+      <w:pPr>
+        <w:pStyle w:val="ListParagraph"/>
+        <w:numPr>
+          <w:ilvl w:val="1"/>
+          <w:numId w:val="4"/>
+        </w:numPr>
+        <w:rPr>
+          <w:rFonts w:cstheme="minorHAnsi"/>
+        </w:rPr>
+      </w:pPr>
+      <w:r>
+        <w:rPr>
+          <w:rFonts w:cstheme="minorHAnsi"/>
+        </w:rPr>
+        <w:t>Accordions may be used to reduce required scrolling</w:t>
+      </w:r>
+    </w:p>
+    <w:p>
+      <w:pPr>
+        <w:pStyle w:val="ListParagraph"/>
+        <w:numPr>
+          <w:ilvl w:val="1"/>
+          <w:numId w:val="4"/>
+        </w:numPr>
+        <w:rPr>
+          <w:rFonts w:cstheme="minorHAnsi"/>
+        </w:rPr>
+      </w:pPr>
+      <w:r>
+        <w:rPr>
+          <w:rFonts w:cstheme="minorHAnsi"/>
+        </w:rPr>
+        <w:t>Additional headings may be added to better label the material and create more pages</w:t>
+      </w:r>
+    </w:p>
+    <w:p>
+      <w:pPr>
+        <w:rPr>
+          <w:rFonts w:cstheme="minorHAnsi"/>
+        </w:rPr>
+      </w:pPr>
+    </w:p>
+    <w:p>
+      <w:pPr>
+        <w:pStyle w:val="Heading1"/>
+      </w:pPr>
+      <w:r>
+        <w:t>Summary</w:t>
+      </w:r>
+    </w:p>
+    <w:p>
+      <w:pPr>
+        <w:rPr>
+          <w:rFonts w:cstheme="minorHAnsi"/>
+          <w:b/>
+        </w:rPr>
+      </w:pPr>
+    </w:p>
+    <w:p>
+      <w:pPr>
+        <w:pStyle w:val="ListParagraph"/>
+        <w:numPr>
+          <w:ilvl w:val="0"/>
+          <w:numId w:val="4"/>
+        </w:numPr>
+        <w:rPr>
+          <w:rFonts w:cstheme="minorHAnsi"/>
+        </w:rPr>
+      </w:pPr>
+      <w:r>
+        <w:rPr>
+          <w:rFonts w:cstheme="minorHAnsi"/>
+        </w:rPr>
+        <w:t>Ideally about a page</w:t>
+      </w:r>
+    </w:p>
+    <w:p>
+      <w:pPr>
+        <w:pStyle w:val="ListParagraph"/>
+        <w:numPr>
+          <w:ilvl w:val="0"/>
+          <w:numId w:val="4"/>
+        </w:numPr>
+        <w:rPr>
+          <w:rFonts w:cstheme="minorHAnsi"/>
+        </w:rPr>
+      </w:pPr>
+      <w:r>
+        <w:rPr>
+          <w:rFonts w:cstheme="minorHAnsi"/>
+        </w:rPr>
+        <w:t>Bottom of the page has reminder to complete self-test in a call-out box</w:t>
+      </w:r>
+    </w:p>
+    <w:p>
+      <w:pPr>
+        <w:rPr>
+          <w:rFonts w:cstheme="minorHAnsi"/>
+        </w:rPr>
+      </w:pPr>
+    </w:p>
+    <w:p>
+      <w:pPr>
+        <w:pStyle w:val="Heading1"/>
+      </w:pPr>
+      <w:r>
+        <w:t>Self-Test</w:t>
+      </w:r>
+    </w:p>
+    <w:p>
+      <w:pPr>
+        <w:rPr>
+          <w:rFonts w:cstheme="minorHAnsi"/>
+          <w:b/>
+        </w:rPr>
+      </w:pPr>
+    </w:p>
+    <w:p>
+      <w:pPr>
+        <w:pStyle w:val="ListParagraph"/>
+        <w:numPr>
+          <w:ilvl w:val="0"/>
+          <w:numId w:val="4"/>
+        </w:numPr>
+        <w:rPr>
+          <w:rFonts w:cstheme="minorHAnsi"/>
+        </w:rPr>
+      </w:pPr>
+      <w:r>
+        <w:rPr>
+          <w:rFonts w:cstheme="minorHAnsi"/>
+        </w:rPr>
+        <w:t>O</w:t>
+      </w:r>
+      <w:r>
+        <w:rPr>
+          <w:rFonts w:cstheme="minorHAnsi"/>
+        </w:rPr>
+        <w:t>n a separate page</w:t>
+      </w:r>
+    </w:p>
+    <w:p>
+      <w:pPr>
+        <w:rPr>
+          <w:rFonts w:cstheme="minorHAnsi"/>
+        </w:rPr>
+      </w:pPr>
+    </w:p>
+    <w:p>
+      <w:pPr>
+        <w:pStyle w:val="Heading1"/>
+      </w:pPr>
+      <w:r>
+        <w:t>Bibliography</w:t>
+      </w:r>
+    </w:p>
+    <w:p>
+      <w:pPr>
+        <w:rPr>
+          <w:rFonts w:cstheme="minorHAnsi"/>
+          <w:b/>
+        </w:rPr>
+      </w:pPr>
+    </w:p>
+    <w:p>
+      <w:pPr>
+        <w:pStyle w:val="ListParagraph"/>
+        <w:numPr>
+          <w:ilvl w:val="0"/>
+          <w:numId w:val="4"/>
+        </w:numPr>
+        <w:rPr>
+          <w:rFonts w:cstheme="minorHAnsi"/>
+        </w:rPr>
+      </w:pPr>
+      <w:r>
+        <w:rPr>
+          <w:rFonts w:cstheme="minorHAnsi"/>
+        </w:rPr>
+        <w:t>APA style</w:t>
+      </w:r>
+    </w:p>
+    <w:p>
+      <w:pPr>
+        <w:pStyle w:val="ListParagraph"/>
+        <w:numPr>
+          <w:ilvl w:val="0"/>
+          <w:numId w:val="4"/>
+        </w:numPr>
+        <w:rPr>
+          <w:rFonts w:cstheme="minorHAnsi"/>
+        </w:rPr>
+      </w:pPr>
+      <w:r>
+        <w:rPr>
+          <w:rFonts w:cstheme="minorHAnsi"/>
+        </w:rPr>
+        <w:t>Online resources should be hyperlinked</w:t>
+      </w:r>
+    </w:p>
+    <w:p>
+      <w:pPr>
+        <w:rPr>
+          <w:rFonts w:cstheme="minorHAnsi"/>
+          <w:b/>
+        </w:rPr>
+      </w:pPr>
+    </w:p>
+    <w:p>
+      <w:pPr>
+        <w:pStyle w:val="Heading1"/>
+      </w:pPr>
+      <w:r>
+        <w:t>Additional i</w:t>
+      </w:r>
+      <w:r>
+        <w:t>nformation for template</w:t>
+      </w:r>
+    </w:p>
+    <w:p>
+      <w:pPr>
+        <w:rPr>
+          <w:rFonts w:cstheme="minorHAnsi"/>
+          <w:b/>
+        </w:rPr>
+      </w:pPr>
+    </w:p>
+    <w:p>
+      <w:pPr>
+        <w:pStyle w:val="ListParagraph"/>
+        <w:numPr>
+          <w:ilvl w:val="0"/>
+          <w:numId w:val="7"/>
+        </w:numPr>
+        <w:rPr>
+          <w:rFonts w:cstheme="minorHAnsi"/>
+          <w:b/>
+        </w:rPr>
+      </w:pPr>
+      <w:r>
+        <w:rPr>
+          <w:rFonts w:cstheme="minorHAnsi"/>
+        </w:rPr>
+        <w:t>All links in the course should open in new window</w:t>
+      </w:r>
+    </w:p>
+    <w:p>
+      <w:pPr>
+        <w:pStyle w:val="ListParagraph"/>
+        <w:numPr>
+          <w:ilvl w:val="0"/>
+          <w:numId w:val="7"/>
+        </w:numPr>
+      </w:pPr>
+      <w:r>
+        <w:rPr>
+          <w:rFonts w:cstheme="minorHAnsi"/>
+        </w:rPr>
+        <w:t xml:space="preserve">All courses should include a </w:t>
+      </w:r>
+      <w:r>
+        <w:rPr>
+          <w:rFonts w:cstheme="minorHAnsi"/>
+        </w:rPr>
+        <w:t>“</w:t>
+      </w:r>
+      <w:r>
+        <w:rPr>
+          <w:rFonts w:cstheme="minorHAnsi"/>
+          <w:i/>
+        </w:rPr>
+        <w:t>Welcome discussion</w:t>
+      </w:r>
+      <w:r>
+        <w:rPr>
+          <w:rFonts w:cstheme="minorHAnsi"/>
+          <w:i/>
+        </w:rPr>
+        <w:t>”</w:t>
+      </w:r>
+    </w:p>
+    <w:p>
+      <w:pPr>
+        <w:pStyle w:val="ListParagraph"/>
+        <w:numPr>
+          <w:ilvl w:val="0"/>
+          <w:numId w:val="7"/>
+        </w:numPr>
+      </w:pPr>
+      <w:r>
+        <w:t xml:space="preserve">All courses should contain a discussion topic called </w:t>
+      </w:r>
+      <w:r>
+        <w:t>“</w:t>
+      </w:r>
+      <w:r>
+        <w:rPr>
+          <w:i/>
+        </w:rPr>
+        <w:t>Q&amp;A discus</w:t>
+      </w:r>
+      <w:r>
+        <w:rPr>
+          <w:i/>
+        </w:rPr>
+        <w:t>s</w:t>
+      </w:r>
+      <w:r>
+        <w:rPr>
+          <w:i/>
+        </w:rPr>
+        <w:t>ion</w:t>
+      </w:r>
+      <w:r>
+        <w:t xml:space="preserve"> </w:t>
+      </w:r>
+      <w:r>
+        <w:t>“</w:t>
+      </w:r>
+    </w:p>
+    <w:sectPr>
+      <w:headerReference w:type="even" r:id="rId7"/>
+      <w:headerReference w:type="default" r:id="rId8"/>
+      <w:footerReference w:type="even" r:id="rId9"/>
+      <w:footerReference w:type="default" r:id="rId10"/>
+      <w:headerReference w:type="first" r:id="rId11"/>
+      <w:footerReference w:type="first" r:id="rId12"/>
+      <w:pgSz w:w="12240" w:h="15840"/>
+      <w:pgMar w:top="1440" w:right="1440" w:bottom="1440" w:left="1440" w:header="708" w:footer="708" w:gutter="0"/>
+      <w:cols w:space="708"/>
+      <w:docGrid w:linePitch="360"/>
+    </w:sectPr>
+  </w:body>
+</w:document>
+</file>
+
+<file path=word/endnotes.xml><?xml version="1.0" encoding="utf-8"?>
+<w:endnotes xmlns:wpc="http://schemas.microsoft.com/office/word/2010/wordprocessingCanvas" xmlns:cx="http://schemas.microsoft.com/office/drawing/2014/chartex" xmlns:cx1="http://schemas.microsoft.com/office/drawing/2015/9/8/chartex" xmlns:mc="http://schemas.openxmlformats.org/markup-compatibility/2006" xmlns:o="urn:schemas-microsoft-com:office:office" xmlns:r="http://schemas.openxmlformats.org/officeDocument/2006/relationships" xmlns:m="http://schemas.openxmlformats.org/officeDocument/2006/math" xmlns:v="urn:schemas-microsoft-com:vml" xmlns:wp14="http://schemas.microsoft.com/office/word/2010/wordprocessingDrawing" xmlns:wp="http://schemas.openxmlformats.org/drawingml/2006/wordprocessingDrawing" xmlns:w10="urn:schemas-microsoft-com:office:word" xmlns:w="http://schemas.openxmlformats.org/wordprocessingml/2006/main" xmlns:w14="http://schemas.microsoft.com/office/word/2010/wordml" xmlns:w15="http://schemas.microsoft.com/office/word/2012/wordml" xmlns:w16se="http://schemas.microsoft.com/office/word/2015/wordml/symex" xmlns:wpg="http://schemas.microsoft.com/office/word/2010/wordprocessingGroup" xmlns:wpi="http://schemas.microsoft.com/office/word/2010/wordprocessingInk" xmlns:wne="http://schemas.microsoft.com/office/word/2006/wordml" xmlns:wps="http://schemas.microsoft.com/office/word/2010/wordprocessingShape" mc:Ignorable="w14 w15 w16se wp14">
+  <w:endnote w:type="separator" w:id="-1">
+    <w:p>
+      <w:r>
+        <w:separator/>
+      </w:r>
+    </w:p>
+  </w:endnote>
+  <w:endnote w:type="continuationSeparator" w:id="0">
+    <w:p>
+      <w:r>
+        <w:continuationSeparator/>
+      </w:r>
+    </w:p>
+  </w:endnote>
+</w:endnotes>
+</file>
+
+<file path=word/footer1.xml><?xml version="1.0" encoding="utf-8"?>
+<w:ftr xmlns:wpc="http://schemas.microsoft.com/office/word/2010/wordprocessingCanvas" xmlns:cx="http://schemas.microsoft.com/office/drawing/2014/chartex" xmlns:cx1="http://schemas.microsoft.com/office/drawing/2015/9/8/chartex" xmlns:mc="http://schemas.openxmlformats.org/markup-compatibility/2006" xmlns:o="urn:schemas-microsoft-com:office:office" xmlns:r="http://schemas.openxmlformats.org/officeDocument/2006/relationships" xmlns:m="http://schemas.openxmlformats.org/officeDocument/2006/math" xmlns:v="urn:schemas-microsoft-com:vml" xmlns:wp14="http://schemas.microsoft.com/office/word/2010/wordprocessingDrawing" xmlns:wp="http://schemas.openxmlformats.org/drawingml/2006/wordprocessingDrawing" xmlns:w10="urn:schemas-microsoft-com:office:word" xmlns:w="http://schemas.openxmlformats.org/wordprocessingml/2006/main" xmlns:w14="http://schemas.microsoft.com/office/word/2010/wordml" xmlns:w15="http://schemas.microsoft.com/office/word/2012/wordml" xmlns:w16se="http://schemas.microsoft.com/office/word/2015/wordml/symex" xmlns:wpg="http://schemas.microsoft.com/office/word/2010/wordprocessingGroup" xmlns:wpi="http://schemas.microsoft.com/office/word/2010/wordprocessingInk" xmlns:wne="http://schemas.microsoft.com/office/word/2006/wordml" xmlns:wps="http://schemas.microsoft.com/office/word/2010/wordprocessingShape" mc:Ignorable="w14 w15 w16se wp14">
+  <w:p>
+    <w:pPr>
+      <w:pStyle w:val="Footer"/>
+    </w:pPr>
+  </w:p>
+</w:ftr>
+</file>
+
+<file path=word/footer2.xml><?xml version="1.0" encoding="utf-8"?>
+<w:ftr xmlns:wpc="http://schemas.microsoft.com/office/word/2010/wordprocessingCanvas" xmlns:cx="http://schemas.microsoft.com/office/drawing/2014/chartex" xmlns:cx1="http://schemas.microsoft.com/office/drawing/2015/9/8/chartex" xmlns:mc="http://schemas.openxmlformats.org/markup-compatibility/2006" xmlns:o="urn:schemas-microsoft-com:office:office" xmlns:r="http://schemas.openxmlformats.org/officeDocument/2006/relationships" xmlns:m="http://schemas.openxmlformats.org/officeDocument/2006/math" xmlns:v="urn:schemas-microsoft-com:vml" xmlns:wp14="http://schemas.microsoft.com/office/word/2010/wordprocessingDrawing" xmlns:wp="http://schemas.openxmlformats.org/drawingml/2006/wordprocessingDrawing" xmlns:w10="urn:schemas-microsoft-com:office:word" xmlns:w="http://schemas.openxmlformats.org/wordprocessingml/2006/main" xmlns:w14="http://schemas.microsoft.com/office/word/2010/wordml" xmlns:w15="http://schemas.microsoft.com/office/word/2012/wordml" xmlns:w16se="http://schemas.microsoft.com/office/word/2015/wordml/symex" xmlns:wpg="http://schemas.microsoft.com/office/word/2010/wordprocessingGroup" xmlns:wpi="http://schemas.microsoft.com/office/word/2010/wordprocessingInk" xmlns:wne="http://schemas.microsoft.com/office/word/2006/wordml" xmlns:wps="http://schemas.microsoft.com/office/word/2010/wordprocessingShape" mc:Ignorable="w14 w15 w16se wp14">
+  <w:p>
+    <w:pPr>
+      <w:pStyle w:val="Footer"/>
+    </w:pPr>
+  </w:p>
+</w:ftr>
+</file>
+
+<file path=word/footer3.xml><?xml version="1.0" encoding="utf-8"?>
+<w:ftr xmlns:wpc="http://schemas.microsoft.com/office/word/2010/wordprocessingCanvas" xmlns:cx="http://schemas.microsoft.com/office/drawing/2014/chartex" xmlns:cx1="http://schemas.microsoft.com/office/drawing/2015/9/8/chartex" xmlns:mc="http://schemas.openxmlformats.org/markup-compatibility/2006" xmlns:o="urn:schemas-microsoft-com:office:office" xmlns:r="http://schemas.openxmlformats.org/officeDocument/2006/relationships" xmlns:m="http://schemas.openxmlformats.org/officeDocument/2006/math" xmlns:v="urn:schemas-microsoft-com:vml" xmlns:wp14="http://schemas.microsoft.com/office/word/2010/wordprocessingDrawing" xmlns:wp="http://schemas.openxmlformats.org/drawingml/2006/wordprocessingDrawing" xmlns:w10="urn:schemas-microsoft-com:office:word" xmlns:w="http://schemas.openxmlformats.org/wordprocessingml/2006/main" xmlns:w14="http://schemas.microsoft.com/office/word/2010/wordml" xmlns:w15="http://schemas.microsoft.com/office/word/2012/wordml" xmlns:w16se="http://schemas.microsoft.com/office/word/2015/wordml/symex" xmlns:wpg="http://schemas.microsoft.com/office/word/2010/wordprocessingGroup" xmlns:wpi="http://schemas.microsoft.com/office/word/2010/wordprocessingInk" xmlns:wne="http://schemas.microsoft.com/office/word/2006/wordml" xmlns:wps="http://schemas.microsoft.com/office/word/2010/wordprocessingShape" mc:Ignorable="w14 w15 w16se wp14">
+  <w:p>
+    <w:pPr>
+      <w:pStyle w:val="Footer"/>
+    </w:pPr>
+  </w:p>
+</w:ftr>
+</file>
+
+<file path=word/footnotes.xml><?xml version="1.0" encoding="utf-8"?>
+<w:footnotes xmlns:wpc="http://schemas.microsoft.com/office/word/2010/wordprocessingCanvas" xmlns:cx="http://schemas.microsoft.com/office/drawing/2014/chartex" xmlns:cx1="http://schemas.microsoft.com/office/drawing/2015/9/8/chartex" xmlns:mc="http://schemas.openxmlformats.org/markup-compatibility/2006" xmlns:o="urn:schemas-microsoft-com:office:office" xmlns:r="http://schemas.openxmlformats.org/officeDocument/2006/relationships" xmlns:m="http://schemas.openxmlformats.org/officeDocument/2006/math" xmlns:v="urn:schemas-microsoft-com:vml" xmlns:wp14="http://schemas.microsoft.com/office/word/2010/wordprocessingDrawing" xmlns:wp="http://schemas.openxmlformats.org/drawingml/2006/wordprocessingDrawing" xmlns:w10="urn:schemas-microsoft-com:office:word" xmlns:w="http://schemas.openxmlformats.org/wordprocessingml/2006/main" xmlns:w14="http://schemas.microsoft.com/office/word/2010/wordml" xmlns:w15="http://schemas.microsoft.com/office/word/2012/wordml" xmlns:w16se="http://schemas.microsoft.com/office/word/2015/wordml/symex" xmlns:wpg="http://schemas.microsoft.com/office/word/2010/wordprocessingGroup" xmlns:wpi="http://schemas.microsoft.com/office/word/2010/wordprocessingInk" xmlns:wne="http://schemas.microsoft.com/office/word/2006/wordml" xmlns:wps="http://schemas.microsoft.com/office/word/2010/wordprocessingShape" mc:Ignorable="w14 w15 w16se wp14">
+  <w:footnote w:type="separator" w:id="-1">
+    <w:p>
+      <w:r>
+        <w:separator/>
+      </w:r>
+    </w:p>
+  </w:footnote>
+  <w:footnote w:type="continuationSeparator" w:id="0">
+    <w:p>
+      <w:r>
+        <w:continuationSeparator/>
+      </w:r>
+    </w:p>
+  </w:footnote>
+</w:footnotes>
+</file>
+
+<file path=word/header1.xml><?xml version="1.0" encoding="utf-8"?>
+<w:hdr xmlns:wpc="http://schemas.microsoft.com/office/word/2010/wordprocessingCanvas" xmlns:cx="http://schemas.microsoft.com/office/drawing/2014/chartex" xmlns:cx1="http://schemas.microsoft.com/office/drawing/2015/9/8/chartex" xmlns:mc="http://schemas.openxmlformats.org/markup-compatibility/2006" xmlns:o="urn:schemas-microsoft-com:office:office" xmlns:r="http://schemas.openxmlformats.org/officeDocument/2006/relationships" xmlns:m="http://schemas.openxmlformats.org/officeDocument/2006/math" xmlns:v="urn:schemas-microsoft-com:vml" xmlns:wp14="http://schemas.microsoft.com/office/word/2010/wordprocessingDrawing" xmlns:wp="http://schemas.openxmlformats.org/drawingml/2006/wordprocessingDrawing" xmlns:w10="urn:schemas-microsoft-com:office:word" xmlns:w="http://schemas.openxmlformats.org/wordprocessingml/2006/main" xmlns:w14="http://schemas.microsoft.com/office/word/2010/wordml" xmlns:w15="http://schemas.microsoft.com/office/word/2012/wordml" xmlns:w16se="http://schemas.microsoft.com/office/word/2015/wordml/symex" xmlns:wpg="http://schemas.microsoft.com/office/word/2010/wordprocessingGroup" xmlns:wpi="http://schemas.microsoft.com/office/word/2010/wordprocessingInk" xmlns:wne="http://schemas.microsoft.com/office/word/2006/wordml" xmlns:wps="http://schemas.microsoft.com/office/word/2010/wordprocessingShape" mc:Ignorable="w14 w15 w16se wp14">
+  <w:p>
+    <w:pPr>
+      <w:pStyle w:val="Header"/>
+    </w:pPr>
+  </w:p>
+</w:hdr>
+</file>
+
+<file path=word/header2.xml><?xml version="1.0" encoding="utf-8"?>
+<w:hdr xmlns:wpc="http://schemas.microsoft.com/office/word/2010/wordprocessingCanvas" xmlns:cx="http://schemas.microsoft.com/office/drawing/2014/chartex" xmlns:cx1="http://schemas.microsoft.com/office/drawing/2015/9/8/chartex" xmlns:mc="http://schemas.openxmlformats.org/markup-compatibility/2006" xmlns:o="urn:schemas-microsoft-com:office:office" xmlns:r="http://schemas.openxmlformats.org/officeDocument/2006/relationships" xmlns:m="http://schemas.openxmlformats.org/officeDocument/2006/math" xmlns:v="urn:schemas-microsoft-com:vml" xmlns:wp14="http://schemas.microsoft.com/office/word/2010/wordprocessingDrawing" xmlns:wp="http://schemas.openxmlformats.org/drawingml/2006/wordprocessingDrawing" xmlns:w10="urn:schemas-microsoft-com:office:word" xmlns:w="http://schemas.openxmlformats.org/wordprocessingml/2006/main" xmlns:w14="http://schemas.microsoft.com/office/word/2010/wordml" xmlns:w15="http://schemas.microsoft.com/office/word/2012/wordml" xmlns:w16se="http://schemas.microsoft.com/office/word/2015/wordml/symex" xmlns:wpg="http://schemas.microsoft.com/office/word/2010/wordprocessingGroup" xmlns:wpi="http://schemas.microsoft.com/office/word/2010/wordprocessingInk" xmlns:wne="http://schemas.microsoft.com/office/word/2006/wordml" xmlns:wps="http://schemas.microsoft.com/office/word/2010/wordprocessingShape" mc:Ignorable="w14 w15 w16se wp14">
+  <w:p>
+    <w:pPr>
+      <w:pStyle w:val="Header"/>
+    </w:pPr>
+  </w:p>
+</w:hdr>
+</file>
+
+<file path=word/header3.xml><?xml version="1.0" encoding="utf-8"?>
+<w:hdr xmlns:wpc="http://schemas.microsoft.com/office/word/2010/wordprocessingCanvas" xmlns:cx="http://schemas.microsoft.com/office/drawing/2014/chartex" xmlns:cx1="http://schemas.microsoft.com/office/drawing/2015/9/8/chartex" xmlns:mc="http://schemas.openxmlformats.org/markup-compatibility/2006" xmlns:o="urn:schemas-microsoft-com:office:office" xmlns:r="http://schemas.openxmlformats.org/officeDocument/2006/relationships" xmlns:m="http://schemas.openxmlformats.org/officeDocument/2006/math" xmlns:v="urn:schemas-microsoft-com:vml" xmlns:wp14="http://schemas.microsoft.com/office/word/2010/wordprocessingDrawing" xmlns:wp="http://schemas.openxmlformats.org/drawingml/2006/wordprocessingDrawing" xmlns:w10="urn:schemas-microsoft-com:office:word" xmlns:w="http://schemas.openxmlformats.org/wordprocessingml/2006/main" xmlns:w14="http://schemas.microsoft.com/office/word/2010/wordml" xmlns:w15="http://schemas.microsoft.com/office/word/2012/wordml" xmlns:w16se="http://schemas.microsoft.com/office/word/2015/wordml/symex" xmlns:wpg="http://schemas.microsoft.com/office/word/2010/wordprocessingGroup" xmlns:wpi="http://schemas.microsoft.com/office/word/2010/wordprocessingInk" xmlns:wne="http://schemas.microsoft.com/office/word/2006/wordml" xmlns:wps="http://schemas.microsoft.com/office/word/2010/wordprocessingShape" mc:Ignorable="w14 w15 w16se wp14">
+  <w:p>
+    <w:pPr>
+      <w:pStyle w:val="Header"/>
+    </w:pPr>
+  </w:p>
+</w:hdr>
+</file>
 
 <file path=word/numbering.xml><?xml version="1.0" encoding="utf-8"?>
 <w:numbering xmlns:wpc="http://schemas.microsoft.com/office/word/2010/wordprocessingCanvas" xmlns:cx="http://schemas.microsoft.com/office/drawing/2014/chartex" xmlns:cx1="http://schemas.microsoft.com/office/drawing/2015/9/8/chartex" xmlns:mc="http://schemas.openxmlformats.org/markup-compatibility/2006" xmlns:o="urn:schemas-microsoft-com:office:office" xmlns:r="http://schemas.openxmlformats.org/officeDocument/2006/relationships" xmlns:m="http://schemas.openxmlformats.org/officeDocument/2006/math" xmlns:v="urn:schemas-microsoft-com:vml" xmlns:wp14="http://schemas.microsoft.com/office/word/2010/wordprocessingDrawing" xmlns:wp="http://schemas.openxmlformats.org/drawingml/2006/wordprocessingDrawing" xmlns:w10="urn:schemas-microsoft-com:office:word" xmlns:w="http://schemas.openxmlformats.org/wordprocessingml/2006/main" xmlns:w14="http://schemas.microsoft.com/office/word/2010/wordml" xmlns:w15="http://schemas.microsoft.com/office/word/2012/wordml" xmlns:w16se="http://schemas.microsoft.com/office/word/2015/wordml/symex" xmlns:wpg="http://schemas.microsoft.com/office/word/2010/wordprocessingGroup" xmlns:wpi="http://schemas.microsoft.com/office/word/2010/wordprocessingInk" xmlns:wne="http://schemas.microsoft.com/office/word/2006/wordml" xmlns:wps="http://schemas.microsoft.com/office/word/2010/wordprocessingShape" mc:Ignorable="w14 w15 w16se wp14">
@@ -1343,4 +3546,877 @@
     <w:abstractNumId w:val="8"/>
   </w:num>
 </w:numbering>
+</file>
+
+<file path=word/styles.xml><?xml version="1.0" encoding="utf-8"?>
+<w:styles xmlns:mc="http://schemas.openxmlformats.org/markup-compatibility/2006" xmlns:r="http://schemas.openxmlformats.org/officeDocument/2006/relationships" xmlns:w="http://schemas.openxmlformats.org/wordprocessingml/2006/main" xmlns:w14="http://schemas.microsoft.com/office/word/2010/wordml" xmlns:w15="http://schemas.microsoft.com/office/word/2012/wordml" xmlns:w16se="http://schemas.microsoft.com/office/word/2015/wordml/symex" mc:Ignorable="w14 w15 w16se">
+  <w:docDefaults>
+    <w:rPrDefault>
+      <w:rPr>
+        <w:rFonts w:asciiTheme="minorHAnsi" w:eastAsiaTheme="minorHAnsi" w:hAnsiTheme="minorHAnsi" w:cstheme="minorBidi"/>
+        <w:sz w:val="24"/>
+        <w:szCs w:val="24"/>
+        <w:lang w:val="en-US" w:eastAsia="en-US" w:bidi="ar-SA"/>
+      </w:rPr>
+    </w:rPrDefault>
+    <w:pPrDefault/>
+  </w:docDefaults>
+  <w:latentStyles w:defLockedState="0" w:defUIPriority="99" w:defSemiHidden="0" w:defUnhideWhenUsed="0" w:defQFormat="0" w:count="371">
+    <w:lsdException w:name="Normal" w:uiPriority="0" w:qFormat="1"/>
+    <w:lsdException w:name="heading 1" w:uiPriority="9" w:qFormat="1"/>
+    <w:lsdException w:name="heading 2" w:semiHidden="1" w:uiPriority="9" w:unhideWhenUsed="1" w:qFormat="1"/>
+    <w:lsdException w:name="heading 3" w:semiHidden="1" w:uiPriority="9" w:unhideWhenUsed="1" w:qFormat="1"/>
+    <w:lsdException w:name="heading 4" w:semiHidden="1" w:uiPriority="9" w:unhideWhenUsed="1" w:qFormat="1"/>
+    <w:lsdException w:name="heading 5" w:semiHidden="1" w:uiPriority="9" w:unhideWhenUsed="1" w:qFormat="1"/>
+    <w:lsdException w:name="heading 6" w:semiHidden="1" w:uiPriority="9" w:unhideWhenUsed="1" w:qFormat="1"/>
+    <w:lsdException w:name="heading 7" w:semiHidden="1" w:uiPriority="9" w:unhideWhenUsed="1" w:qFormat="1"/>
+    <w:lsdException w:name="heading 8" w:semiHidden="1" w:uiPriority="9" w:unhideWhenUsed="1" w:qFormat="1"/>
+    <w:lsdException w:name="heading 9" w:semiHidden="1" w:uiPriority="9" w:unhideWhenUsed="1" w:qFormat="1"/>
+    <w:lsdException w:name="index 1" w:semiHidden="1" w:unhideWhenUsed="1"/>
+    <w:lsdException w:name="index 2" w:semiHidden="1" w:unhideWhenUsed="1"/>
+    <w:lsdException w:name="index 3" w:semiHidden="1" w:unhideWhenUsed="1"/>
+    <w:lsdException w:name="index 4" w:semiHidden="1" w:unhideWhenUsed="1"/>
+    <w:lsdException w:name="index 5" w:semiHidden="1" w:unhideWhenUsed="1"/>
+    <w:lsdException w:name="index 6" w:semiHidden="1" w:unhideWhenUsed="1"/>
+    <w:lsdException w:name="index 7" w:semiHidden="1" w:unhideWhenUsed="1"/>
+    <w:lsdException w:name="index 8" w:semiHidden="1" w:unhideWhenUsed="1"/>
+    <w:lsdException w:name="index 9" w:semiHidden="1" w:unhideWhenUsed="1"/>
+    <w:lsdException w:name="toc 1" w:semiHidden="1" w:uiPriority="39" w:unhideWhenUsed="1"/>
+    <w:lsdException w:name="toc 2" w:semiHidden="1" w:uiPriority="39" w:unhideWhenUsed="1"/>
+    <w:lsdException w:name="toc 3" w:semiHidden="1" w:uiPriority="39" w:unhideWhenUsed="1"/>
+    <w:lsdException w:name="toc 4" w:semiHidden="1" w:uiPriority="39" w:unhideWhenUsed="1"/>
+    <w:lsdException w:name="toc 5" w:semiHidden="1" w:uiPriority="39" w:unhideWhenUsed="1"/>
+    <w:lsdException w:name="toc 6" w:semiHidden="1" w:uiPriority="39" w:unhideWhenUsed="1"/>
+    <w:lsdException w:name="toc 7" w:semiHidden="1" w:uiPriority="39" w:unhideWhenUsed="1"/>
+    <w:lsdException w:name="toc 8" w:semiHidden="1" w:uiPriority="39" w:unhideWhenUsed="1"/>
+    <w:lsdException w:name="toc 9" w:semiHidden="1" w:uiPriority="39" w:unhideWhenUsed="1"/>
+    <w:lsdException w:name="Normal Indent" w:semiHidden="1" w:unhideWhenUsed="1"/>
+    <w:lsdException w:name="footnote text" w:semiHidden="1" w:unhideWhenUsed="1"/>
+    <w:lsdException w:name="annotation text" w:semiHidden="1" w:unhideWhenUsed="1"/>
+    <w:lsdException w:name="header" w:semiHidden="1" w:unhideWhenUsed="1"/>
+    <w:lsdException w:name="footer" w:semiHidden="1" w:unhideWhenUsed="1"/>
+    <w:lsdException w:name="index heading" w:semiHidden="1" w:unhideWhenUsed="1"/>
+    <w:lsdException w:name="caption" w:semiHidden="1" w:uiPriority="35" w:unhideWhenUsed="1" w:qFormat="1"/>
+    <w:lsdException w:name="table of figures" w:semiHidden="1" w:unhideWhenUsed="1"/>
+    <w:lsdException w:name="envelope address" w:semiHidden="1" w:unhideWhenUsed="1"/>
+    <w:lsdException w:name="envelope return" w:semiHidden="1" w:unhideWhenUsed="1"/>
+    <w:lsdException w:name="footnote reference" w:semiHidden="1" w:unhideWhenUsed="1"/>
+    <w:lsdException w:name="annotation reference" w:semiHidden="1" w:unhideWhenUsed="1"/>
+    <w:lsdException w:name="line number" w:semiHidden="1" w:unhideWhenUsed="1"/>
+    <w:lsdException w:name="page number" w:semiHidden="1" w:unhideWhenUsed="1"/>
+    <w:lsdException w:name="endnote reference" w:semiHidden="1" w:unhideWhenUsed="1"/>
+    <w:lsdException w:name="endnote text" w:semiHidden="1" w:unhideWhenUsed="1"/>
+    <w:lsdException w:name="table of authorities" w:semiHidden="1" w:unhideWhenUsed="1"/>
+    <w:lsdException w:name="macro" w:semiHidden="1" w:unhideWhenUsed="1"/>
+    <w:lsdException w:name="toa heading" w:semiHidden="1" w:unhideWhenUsed="1"/>
+    <w:lsdException w:name="List" w:semiHidden="1" w:unhideWhenUsed="1"/>
+    <w:lsdException w:name="List Bullet" w:semiHidden="1" w:unhideWhenUsed="1"/>
+    <w:lsdException w:name="List Number" w:semiHidden="1" w:unhideWhenUsed="1"/>
+    <w:lsdException w:name="List 2" w:semiHidden="1" w:unhideWhenUsed="1"/>
+    <w:lsdException w:name="List 3" w:semiHidden="1" w:unhideWhenUsed="1"/>
+    <w:lsdException w:name="List 4" w:semiHidden="1" w:unhideWhenUsed="1"/>
+    <w:lsdException w:name="List 5" w:semiHidden="1" w:unhideWhenUsed="1"/>
+    <w:lsdException w:name="List Bullet 2" w:semiHidden="1" w:unhideWhenUsed="1"/>
+    <w:lsdException w:name="List Bullet 3" w:semiHidden="1" w:unhideWhenUsed="1"/>
+    <w:lsdException w:name="List Bullet 4" w:semiHidden="1" w:unhideWhenUsed="1"/>
+    <w:lsdException w:name="List Bullet 5" w:semiHidden="1" w:unhideWhenUsed="1"/>
+    <w:lsdException w:name="List Number 2" w:semiHidden="1" w:unhideWhenUsed="1"/>
+    <w:lsdException w:name="List Number 3" w:semiHidden="1" w:unhideWhenUsed="1"/>
+    <w:lsdException w:name="List Number 4" w:semiHidden="1" w:unhideWhenUsed="1"/>
+    <w:lsdException w:name="List Number 5" w:semiHidden="1" w:unhideWhenUsed="1"/>
+    <w:lsdException w:name="Title" w:uiPriority="10" w:qFormat="1"/>
+    <w:lsdException w:name="Closing" w:semiHidden="1" w:unhideWhenUsed="1"/>
+    <w:lsdException w:name="Signature" w:semiHidden="1" w:unhideWhenUsed="1"/>
+    <w:lsdException w:name="Default Paragraph Font" w:semiHidden="1" w:uiPriority="1" w:unhideWhenUsed="1"/>
+    <w:lsdException w:name="Body Text" w:semiHidden="1" w:unhideWhenUsed="1"/>
+    <w:lsdException w:name="Body Text Indent" w:semiHidden="1" w:unhideWhenUsed="1"/>
+    <w:lsdException w:name="List Continue" w:semiHidden="1" w:unhideWhenUsed="1"/>
+    <w:lsdException w:name="List Continue 2" w:semiHidden="1" w:unhideWhenUsed="1"/>
+    <w:lsdException w:name="List Continue 3" w:semiHidden="1" w:unhideWhenUsed="1"/>
+    <w:lsdException w:name="List Continue 4" w:semiHidden="1" w:unhideWhenUsed="1"/>
+    <w:lsdException w:name="List Continue 5" w:semiHidden="1" w:unhideWhenUsed="1"/>
+    <w:lsdException w:name="Message Header" w:semiHidden="1" w:unhideWhenUsed="1"/>
+    <w:lsdException w:name="Subtitle" w:uiPriority="11" w:qFormat="1"/>
+    <w:lsdException w:name="Salutation" w:semiHidden="1" w:unhideWhenUsed="1"/>
+    <w:lsdException w:name="Date" w:semiHidden="1" w:unhideWhenUsed="1"/>
+    <w:lsdException w:name="Body Text First Indent" w:semiHidden="1" w:unhideWhenUsed="1"/>
+    <w:lsdException w:name="Body Text First Indent 2" w:semiHidden="1" w:unhideWhenUsed="1"/>
+    <w:lsdException w:name="Note Heading" w:semiHidden="1" w:unhideWhenUsed="1"/>
+    <w:lsdException w:name="Body Text 2" w:semiHidden="1" w:unhideWhenUsed="1"/>
+    <w:lsdException w:name="Body Text 3" w:semiHidden="1" w:unhideWhenUsed="1"/>
+    <w:lsdException w:name="Body Text Indent 2" w:semiHidden="1" w:unhideWhenUsed="1"/>
+    <w:lsdException w:name="Body Text Indent 3" w:semiHidden="1" w:unhideWhenUsed="1"/>
+    <w:lsdException w:name="Block Text" w:semiHidden="1" w:unhideWhenUsed="1"/>
+    <w:lsdException w:name="Hyperlink" w:semiHidden="1" w:unhideWhenUsed="1"/>
+    <w:lsdException w:name="FollowedHyperlink" w:semiHidden="1" w:unhideWhenUsed="1"/>
+    <w:lsdException w:name="Strong" w:uiPriority="22" w:qFormat="1"/>
+    <w:lsdException w:name="Emphasis" w:uiPriority="20" w:qFormat="1"/>
+    <w:lsdException w:name="Document Map" w:semiHidden="1" w:unhideWhenUsed="1"/>
+    <w:lsdException w:name="Plain Text" w:semiHidden="1" w:unhideWhenUsed="1"/>
+    <w:lsdException w:name="E-mail Signature" w:semiHidden="1" w:unhideWhenUsed="1"/>
+    <w:lsdException w:name="HTML Top of Form" w:semiHidden="1" w:unhideWhenUsed="1"/>
+    <w:lsdException w:name="HTML Bottom of Form" w:semiHidden="1" w:unhideWhenUsed="1"/>
+    <w:lsdException w:name="Normal (Web)" w:semiHidden="1" w:unhideWhenUsed="1"/>
+    <w:lsdException w:name="HTML Acronym" w:semiHidden="1" w:unhideWhenUsed="1"/>
+    <w:lsdException w:name="HTML Address" w:semiHidden="1" w:unhideWhenUsed="1"/>
+    <w:lsdException w:name="HTML Cite" w:semiHidden="1" w:unhideWhenUsed="1"/>
+    <w:lsdException w:name="HTML Code" w:semiHidden="1" w:unhideWhenUsed="1"/>
+    <w:lsdException w:name="HTML Definition" w:semiHidden="1" w:unhideWhenUsed="1"/>
+    <w:lsdException w:name="HTML Keyboard" w:semiHidden="1" w:unhideWhenUsed="1"/>
+    <w:lsdException w:name="HTML Preformatted" w:semiHidden="1" w:unhideWhenUsed="1"/>
+    <w:lsdException w:name="HTML Sample" w:semiHidden="1" w:unhideWhenUsed="1"/>
+    <w:lsdException w:name="HTML Typewriter" w:semiHidden="1" w:unhideWhenUsed="1"/>
+    <w:lsdException w:name="HTML Variable" w:semiHidden="1" w:unhideWhenUsed="1"/>
+    <w:lsdException w:name="Normal Table" w:semiHidden="1" w:unhideWhenUsed="1"/>
+    <w:lsdException w:name="annotation subject" w:semiHidden="1" w:unhideWhenUsed="1"/>
+    <w:lsdException w:name="No List" w:semiHidden="1" w:unhideWhenUsed="1"/>
+    <w:lsdException w:name="Outline List 1" w:semiHidden="1" w:unhideWhenUsed="1"/>
+    <w:lsdException w:name="Outline List 2" w:semiHidden="1" w:unhideWhenUsed="1"/>
+    <w:lsdException w:name="Outline List 3" w:semiHidden="1" w:unhideWhenUsed="1"/>
+    <w:lsdException w:name="Table Simple 1" w:semiHidden="1" w:unhideWhenUsed="1"/>
+    <w:lsdException w:name="Table Simple 2" w:semiHidden="1" w:unhideWhenUsed="1"/>
+    <w:lsdException w:name="Table Simple 3" w:semiHidden="1" w:unhideWhenUsed="1"/>
+    <w:lsdException w:name="Table Classic 1" w:semiHidden="1" w:unhideWhenUsed="1"/>
+    <w:lsdException w:name="Table Classic 2" w:semiHidden="1" w:unhideWhenUsed="1"/>
+    <w:lsdException w:name="Table Classic 3" w:semiHidden="1" w:unhideWhenUsed="1"/>
+    <w:lsdException w:name="Table Classic 4" w:semiHidden="1" w:unhideWhenUsed="1"/>
+    <w:lsdException w:name="Table Colorful 1" w:semiHidden="1" w:unhideWhenUsed="1"/>
+    <w:lsdException w:name="Table Colorful 2" w:semiHidden="1" w:unhideWhenUsed="1"/>
+    <w:lsdException w:name="Table Colorful 3" w:semiHidden="1" w:unhideWhenUsed="1"/>
+    <w:lsdException w:name="Table Columns 1" w:semiHidden="1" w:unhideWhenUsed="1"/>
+    <w:lsdException w:name="Table Columns 2" w:semiHidden="1" w:unhideWhenUsed="1"/>
+    <w:lsdException w:name="Table Columns 3" w:semiHidden="1" w:unhideWhenUsed="1"/>
+    <w:lsdException w:name="Table Columns 4" w:semiHidden="1" w:unhideWhenUsed="1"/>
+    <w:lsdException w:name="Table Columns 5" w:semiHidden="1" w:unhideWhenUsed="1"/>
+    <w:lsdException w:name="Table Grid 1" w:semiHidden="1" w:unhideWhenUsed="1"/>
+    <w:lsdException w:name="Table Grid 2" w:semiHidden="1" w:unhideWhenUsed="1"/>
+    <w:lsdException w:name="Table Grid 3" w:semiHidden="1" w:unhideWhenUsed="1"/>
+    <w:lsdException w:name="Table Grid 4" w:semiHidden="1" w:unhideWhenUsed="1"/>
+    <w:lsdException w:name="Table Grid 5" w:semiHidden="1" w:unhideWhenUsed="1"/>
+    <w:lsdException w:name="Table Grid 6" w:semiHidden="1" w:unhideWhenUsed="1"/>
+    <w:lsdException w:name="Table Grid 7" w:semiHidden="1" w:unhideWhenUsed="1"/>
+    <w:lsdException w:name="Table Grid 8" w:semiHidden="1" w:unhideWhenUsed="1"/>
+    <w:lsdException w:name="Table List 1" w:semiHidden="1" w:unhideWhenUsed="1"/>
+    <w:lsdException w:name="Table List 2" w:semiHidden="1" w:unhideWhenUsed="1"/>
+    <w:lsdException w:name="Table List 3" w:semiHidden="1" w:unhideWhenUsed="1"/>
+    <w:lsdException w:name="Table List 4" w:semiHidden="1" w:unhideWhenUsed="1"/>
+    <w:lsdException w:name="Table List 5" w:semiHidden="1" w:unhideWhenUsed="1"/>
+    <w:lsdException w:name="Table List 6" w:semiHidden="1" w:unhideWhenUsed="1"/>
+    <w:lsdException w:name="Table List 7" w:semiHidden="1" w:unhideWhenUsed="1"/>
+    <w:lsdException w:name="Table List 8" w:semiHidden="1" w:unhideWhenUsed="1"/>
+    <w:lsdException w:name="Table 3D effects 1" w:semiHidden="1" w:unhideWhenUsed="1"/>
+    <w:lsdException w:name="Table 3D effects 2" w:semiHidden="1" w:unhideWhenUsed="1"/>
+    <w:lsdException w:name="Table 3D effects 3" w:semiHidden="1" w:unhideWhenUsed="1"/>
+    <w:lsdException w:name="Table Contemporary" w:semiHidden="1" w:unhideWhenUsed="1"/>
+    <w:lsdException w:name="Table Elegant" w:semiHidden="1" w:unhideWhenUsed="1"/>
+    <w:lsdException w:name="Table Professional" w:semiHidden="1" w:unhideWhenUsed="1"/>
+    <w:lsdException w:name="Table Subtle 1" w:semiHidden="1" w:unhideWhenUsed="1"/>
+    <w:lsdException w:name="Table Subtle 2" w:semiHidden="1" w:unhideWhenUsed="1"/>
+    <w:lsdException w:name="Table Web 1" w:semiHidden="1" w:unhideWhenUsed="1"/>
+    <w:lsdException w:name="Table Web 2" w:semiHidden="1" w:unhideWhenUsed="1"/>
+    <w:lsdException w:name="Table Web 3" w:semiHidden="1" w:unhideWhenUsed="1"/>
+    <w:lsdException w:name="Balloon Text" w:semiHidden="1" w:unhideWhenUsed="1"/>
+    <w:lsdException w:name="Table Grid" w:uiPriority="39"/>
+    <w:lsdException w:name="Table Theme" w:semiHidden="1" w:unhideWhenUsed="1"/>
+    <w:lsdException w:name="Placeholder Text" w:semiHidden="1"/>
+    <w:lsdException w:name="No Spacing" w:uiPriority="1" w:qFormat="1"/>
+    <w:lsdException w:name="Light Shading" w:uiPriority="60"/>
+    <w:lsdException w:name="Light List" w:uiPriority="61"/>
+    <w:lsdException w:name="Light Grid" w:uiPriority="62"/>
+    <w:lsdException w:name="Medium Shading 1" w:uiPriority="63"/>
+    <w:lsdException w:name="Medium Shading 2" w:uiPriority="64"/>
+    <w:lsdException w:name="Medium List 1" w:uiPriority="65"/>
+    <w:lsdException w:name="Medium List 2" w:uiPriority="66"/>
+    <w:lsdException w:name="Medium Grid 1" w:uiPriority="67"/>
+    <w:lsdException w:name="Medium Grid 2" w:uiPriority="68"/>
+    <w:lsdException w:name="Medium Grid 3" w:uiPriority="69"/>
+    <w:lsdException w:name="Dark List" w:uiPriority="70"/>
+    <w:lsdException w:name="Colorful Shading" w:uiPriority="71"/>
+    <w:lsdException w:name="Colorful List" w:uiPriority="72"/>
+    <w:lsdException w:name="Colorful Grid" w:uiPriority="73"/>
+    <w:lsdException w:name="Light Shading Accent 1" w:uiPriority="60"/>
+    <w:lsdException w:name="Light List Accent 1" w:uiPriority="61"/>
+    <w:lsdException w:name="Light Grid Accent 1" w:uiPriority="62"/>
+    <w:lsdException w:name="Medium Shading 1 Accent 1" w:uiPriority="63"/>
+    <w:lsdException w:name="Medium Shading 2 Accent 1" w:uiPriority="64"/>
+    <w:lsdException w:name="Medium List 1 Accent 1" w:uiPriority="65"/>
+    <w:lsdException w:name="Revision" w:semiHidden="1"/>
+    <w:lsdException w:name="List Paragraph" w:uiPriority="34" w:qFormat="1"/>
+    <w:lsdException w:name="Quote" w:uiPriority="29" w:qFormat="1"/>
+    <w:lsdException w:name="Intense Quote" w:uiPriority="30" w:qFormat="1"/>
+    <w:lsdException w:name="Medium List 2 Accent 1" w:uiPriority="66"/>
+    <w:lsdException w:name="Medium Grid 1 Accent 1" w:uiPriority="67"/>
+    <w:lsdException w:name="Medium Grid 2 Accent 1" w:uiPriority="68"/>
+    <w:lsdException w:name="Medium Grid 3 Accent 1" w:uiPriority="69"/>
+    <w:lsdException w:name="Dark List Accent 1" w:uiPriority="70"/>
+    <w:lsdException w:name="Colorful Shading Accent 1" w:uiPriority="71"/>
+    <w:lsdException w:name="Colorful List Accent 1" w:uiPriority="72"/>
+    <w:lsdException w:name="Colorful Grid Accent 1" w:uiPriority="73"/>
+    <w:lsdException w:name="Light Shading Accent 2" w:uiPriority="60"/>
+    <w:lsdException w:name="Light List Accent 2" w:uiPriority="61"/>
+    <w:lsdException w:name="Light Grid Accent 2" w:uiPriority="62"/>
+    <w:lsdException w:name="Medium Shading 1 Accent 2" w:uiPriority="63"/>
+    <w:lsdException w:name="Medium Shading 2 Accent 2" w:uiPriority="64"/>
+    <w:lsdException w:name="Medium List 1 Accent 2" w:uiPriority="65"/>
+    <w:lsdException w:name="Medium List 2 Accent 2" w:uiPriority="66"/>
+    <w:lsdException w:name="Medium Grid 1 Accent 2" w:uiPriority="67"/>
+    <w:lsdException w:name="Medium Grid 2 Accent 2" w:uiPriority="68"/>
+    <w:lsdException w:name="Medium Grid 3 Accent 2" w:uiPriority="69"/>
+    <w:lsdException w:name="Dark List Accent 2" w:uiPriority="70"/>
+    <w:lsdException w:name="Colorful Shading Accent 2" w:uiPriority="71"/>
+    <w:lsdException w:name="Colorful List Accent 2" w:uiPriority="72"/>
+    <w:lsdException w:name="Colorful Grid Accent 2" w:uiPriority="73"/>
+    <w:lsdException w:name="Light Shading Accent 3" w:uiPriority="60"/>
+    <w:lsdException w:name="Light List Accent 3" w:uiPriority="61"/>
+    <w:lsdException w:name="Light Grid Accent 3" w:uiPriority="62"/>
+    <w:lsdException w:name="Medium Shading 1 Accent 3" w:uiPriority="63"/>
+    <w:lsdException w:name="Medium Shading 2 Accent 3" w:uiPriority="64"/>
+    <w:lsdException w:name="Medium List 1 Accent 3" w:uiPriority="65"/>
+    <w:lsdException w:name="Medium List 2 Accent 3" w:uiPriority="66"/>
+    <w:lsdException w:name="Medium Grid 1 Accent 3" w:uiPriority="67"/>
+    <w:lsdException w:name="Medium Grid 2 Accent 3" w:uiPriority="68"/>
+    <w:lsdException w:name="Medium Grid 3 Accent 3" w:uiPriority="69"/>
+    <w:lsdException w:name="Dark List Accent 3" w:uiPriority="70"/>
+    <w:lsdException w:name="Colorful Shading Accent 3" w:uiPriority="71"/>
+    <w:lsdException w:name="Colorful List Accent 3" w:uiPriority="72"/>
+    <w:lsdException w:name="Colorful Grid Accent 3" w:uiPriority="73"/>
+    <w:lsdException w:name="Light Shading Accent 4" w:uiPriority="60"/>
+    <w:lsdException w:name="Light List Accent 4" w:uiPriority="61"/>
+    <w:lsdException w:name="Light Grid Accent 4" w:uiPriority="62"/>
+    <w:lsdException w:name="Medium Shading 1 Accent 4" w:uiPriority="63"/>
+    <w:lsdException w:name="Medium Shading 2 Accent 4" w:uiPriority="64"/>
+    <w:lsdException w:name="Medium List 1 Accent 4" w:uiPriority="65"/>
+    <w:lsdException w:name="Medium List 2 Accent 4" w:uiPriority="66"/>
+    <w:lsdException w:name="Medium Grid 1 Accent 4" w:uiPriority="67"/>
+    <w:lsdException w:name="Medium Grid 2 Accent 4" w:uiPriority="68"/>
+    <w:lsdException w:name="Medium Grid 3 Accent 4" w:uiPriority="69"/>
+    <w:lsdException w:name="Dark List Accent 4" w:uiPriority="70"/>
+    <w:lsdException w:name="Colorful Shading Accent 4" w:uiPriority="71"/>
+    <w:lsdException w:name="Colorful List Accent 4" w:uiPriority="72"/>
+    <w:lsdException w:name="Colorful Grid Accent 4" w:uiPriority="73"/>
+    <w:lsdException w:name="Light Shading Accent 5" w:uiPriority="60"/>
+    <w:lsdException w:name="Light List Accent 5" w:uiPriority="61"/>
+    <w:lsdException w:name="Light Grid Accent 5" w:uiPriority="62"/>
+    <w:lsdException w:name="Medium Shading 1 Accent 5" w:uiPriority="63"/>
+    <w:lsdException w:name="Medium Shading 2 Accent 5" w:uiPriority="64"/>
+    <w:lsdException w:name="Medium List 1 Accent 5" w:uiPriority="65"/>
+    <w:lsdException w:name="Medium List 2 Accent 5" w:uiPriority="66"/>
+    <w:lsdException w:name="Medium Grid 1 Accent 5" w:uiPriority="67"/>
+    <w:lsdException w:name="Medium Grid 2 Accent 5" w:uiPriority="68"/>
+    <w:lsdException w:name="Medium Grid 3 Accent 5" w:uiPriority="69"/>
+    <w:lsdException w:name="Dark List Accent 5" w:uiPriority="70"/>
+    <w:lsdException w:name="Colorful Shading Accent 5" w:uiPriority="71"/>
+    <w:lsdException w:name="Colorful List Accent 5" w:uiPriority="72"/>
+    <w:lsdException w:name="Colorful Grid Accent 5" w:uiPriority="73"/>
+    <w:lsdException w:name="Light Shading Accent 6" w:uiPriority="60"/>
+    <w:lsdException w:name="Light List Accent 6" w:uiPriority="61"/>
+    <w:lsdException w:name="Light Grid Accent 6" w:uiPriority="62"/>
+    <w:lsdException w:name="Medium Shading 1 Accent 6" w:uiPriority="63"/>
+    <w:lsdException w:name="Medium Shading 2 Accent 6" w:uiPriority="64"/>
+    <w:lsdException w:name="Medium List 1 Accent 6" w:uiPriority="65"/>
+    <w:lsdException w:name="Medium List 2 Accent 6" w:uiPriority="66"/>
+    <w:lsdException w:name="Medium Grid 1 Accent 6" w:uiPriority="67"/>
+    <w:lsdException w:name="Medium Grid 2 Accent 6" w:uiPriority="68"/>
+    <w:lsdException w:name="Medium Grid 3 Accent 6" w:uiPriority="69"/>
+    <w:lsdException w:name="Dark List Accent 6" w:uiPriority="70"/>
+    <w:lsdException w:name="Colorful Shading Accent 6" w:uiPriority="71"/>
+    <w:lsdException w:name="Colorful List Accent 6" w:uiPriority="72"/>
+    <w:lsdException w:name="Colorful Grid Accent 6" w:uiPriority="73"/>
+    <w:lsdException w:name="Subtle Emphasis" w:uiPriority="19" w:qFormat="1"/>
+    <w:lsdException w:name="Intense Emphasis" w:uiPriority="21" w:qFormat="1"/>
+    <w:lsdException w:name="Subtle Reference" w:uiPriority="31" w:qFormat="1"/>
+    <w:lsdException w:name="Intense Reference" w:uiPriority="32" w:qFormat="1"/>
+    <w:lsdException w:name="Book Title" w:uiPriority="33" w:qFormat="1"/>
+    <w:lsdException w:name="Bibliography" w:semiHidden="1" w:uiPriority="37" w:unhideWhenUsed="1"/>
+    <w:lsdException w:name="TOC Heading" w:semiHidden="1" w:uiPriority="39" w:unhideWhenUsed="1" w:qFormat="1"/>
+    <w:lsdException w:name="Plain Table 1" w:uiPriority="41"/>
+    <w:lsdException w:name="Plain Table 2" w:uiPriority="42"/>
+    <w:lsdException w:name="Plain Table 3" w:uiPriority="43"/>
+    <w:lsdException w:name="Plain Table 4" w:uiPriority="44"/>
+    <w:lsdException w:name="Plain Table 5" w:uiPriority="45"/>
+    <w:lsdException w:name="Grid Table Light" w:uiPriority="40"/>
+    <w:lsdException w:name="Grid Table 1 Light" w:uiPriority="46"/>
+    <w:lsdException w:name="Grid Table 2" w:uiPriority="47"/>
+    <w:lsdException w:name="Grid Table 3" w:uiPriority="48"/>
+    <w:lsdException w:name="Grid Table 4" w:uiPriority="49"/>
+    <w:lsdException w:name="Grid Table 5 Dark" w:uiPriority="50"/>
+    <w:lsdException w:name="Grid Table 6 Colorful" w:uiPriority="51"/>
+    <w:lsdException w:name="Grid Table 7 Colorful" w:uiPriority="52"/>
+    <w:lsdException w:name="Grid Table 1 Light Accent 1" w:uiPriority="46"/>
+    <w:lsdException w:name="Grid Table 2 Accent 1" w:uiPriority="47"/>
+    <w:lsdException w:name="Grid Table 3 Accent 1" w:uiPriority="48"/>
+    <w:lsdException w:name="Grid Table 4 Accent 1" w:uiPriority="49"/>
+    <w:lsdException w:name="Grid Table 5 Dark Accent 1" w:uiPriority="50"/>
+    <w:lsdException w:name="Grid Table 6 Colorful Accent 1" w:uiPriority="51"/>
+    <w:lsdException w:name="Grid Table 7 Colorful Accent 1" w:uiPriority="52"/>
+    <w:lsdException w:name="Grid Table 1 Light Accent 2" w:uiPriority="46"/>
+    <w:lsdException w:name="Grid Table 2 Accent 2" w:uiPriority="47"/>
+    <w:lsdException w:name="Grid Table 3 Accent 2" w:uiPriority="48"/>
+    <w:lsdException w:name="Grid Table 4 Accent 2" w:uiPriority="49"/>
+    <w:lsdException w:name="Grid Table 5 Dark Accent 2" w:uiPriority="50"/>
+    <w:lsdException w:name="Grid Table 6 Colorful Accent 2" w:uiPriority="51"/>
+    <w:lsdException w:name="Grid Table 7 Colorful Accent 2" w:uiPriority="52"/>
+    <w:lsdException w:name="Grid Table 1 Light Accent 3" w:uiPriority="46"/>
+    <w:lsdException w:name="Grid Table 2 Accent 3" w:uiPriority="47"/>
+    <w:lsdException w:name="Grid Table 3 Accent 3" w:uiPriority="48"/>
+    <w:lsdException w:name="Grid Table 4 Accent 3" w:uiPriority="49"/>
+    <w:lsdException w:name="Grid Table 5 Dark Accent 3" w:uiPriority="50"/>
+    <w:lsdException w:name="Grid Table 6 Colorful Accent 3" w:uiPriority="51"/>
+    <w:lsdException w:name="Grid Table 7 Colorful Accent 3" w:uiPriority="52"/>
+    <w:lsdException w:name="Grid Table 1 Light Accent 4" w:uiPriority="46"/>
+    <w:lsdException w:name="Grid Table 2 Accent 4" w:uiPriority="47"/>
+    <w:lsdException w:name="Grid Table 3 Accent 4" w:uiPriority="48"/>
+    <w:lsdException w:name="Grid Table 4 Accent 4" w:uiPriority="49"/>
+    <w:lsdException w:name="Grid Table 5 Dark Accent 4" w:uiPriority="50"/>
+    <w:lsdException w:name="Grid Table 6 Colorful Accent 4" w:uiPriority="51"/>
+    <w:lsdException w:name="Grid Table 7 Colorful Accent 4" w:uiPriority="52"/>
+    <w:lsdException w:name="Grid Table 1 Light Accent 5" w:uiPriority="46"/>
+    <w:lsdException w:name="Grid Table 2 Accent 5" w:uiPriority="47"/>
+    <w:lsdException w:name="Grid Table 3 Accent 5" w:uiPriority="48"/>
+    <w:lsdException w:name="Grid Table 4 Accent 5" w:uiPriority="49"/>
+    <w:lsdException w:name="Grid Table 5 Dark Accent 5" w:uiPriority="50"/>
+    <w:lsdException w:name="Grid Table 6 Colorful Accent 5" w:uiPriority="51"/>
+    <w:lsdException w:name="Grid Table 7 Colorful Accent 5" w:uiPriority="52"/>
+    <w:lsdException w:name="Grid Table 1 Light Accent 6" w:uiPriority="46"/>
+    <w:lsdException w:name="Grid Table 2 Accent 6" w:uiPriority="47"/>
+    <w:lsdException w:name="Grid Table 3 Accent 6" w:uiPriority="48"/>
+    <w:lsdException w:name="Grid Table 4 Accent 6" w:uiPriority="49"/>
+    <w:lsdException w:name="Grid Table 5 Dark Accent 6" w:uiPriority="50"/>
+    <w:lsdException w:name="Grid Table 6 Colorful Accent 6" w:uiPriority="51"/>
+    <w:lsdException w:name="Grid Table 7 Colorful Accent 6" w:uiPriority="52"/>
+    <w:lsdException w:name="List Table 1 Light" w:uiPriority="46"/>
+    <w:lsdException w:name="List Table 2" w:uiPriority="47"/>
+    <w:lsdException w:name="List Table 3" w:uiPriority="48"/>
+    <w:lsdException w:name="List Table 4" w:uiPriority="49"/>
+    <w:lsdException w:name="List Table 5 Dark" w:uiPriority="50"/>
+    <w:lsdException w:name="List Table 6 Colorful" w:uiPriority="51"/>
+    <w:lsdException w:name="List Table 7 Colorful" w:uiPriority="52"/>
+    <w:lsdException w:name="List Table 1 Light Accent 1" w:uiPriority="46"/>
+    <w:lsdException w:name="List Table 2 Accent 1" w:uiPriority="47"/>
+    <w:lsdException w:name="List Table 3 Accent 1" w:uiPriority="48"/>
+    <w:lsdException w:name="List Table 4 Accent 1" w:uiPriority="49"/>
+    <w:lsdException w:name="List Table 5 Dark Accent 1" w:uiPriority="50"/>
+    <w:lsdException w:name="List Table 6 Colorful Accent 1" w:uiPriority="51"/>
+    <w:lsdException w:name="List Table 7 Colorful Accent 1" w:uiPriority="52"/>
+    <w:lsdException w:name="List Table 1 Light Accent 2" w:uiPriority="46"/>
+    <w:lsdException w:name="List Table 2 Accent 2" w:uiPriority="47"/>
+    <w:lsdException w:name="List Table 3 Accent 2" w:uiPriority="48"/>
+    <w:lsdException w:name="List Table 4 Accent 2" w:uiPriority="49"/>
+    <w:lsdException w:name="List Table 5 Dark Accent 2" w:uiPriority="50"/>
+    <w:lsdException w:name="List Table 6 Colorful Accent 2" w:uiPriority="51"/>
+    <w:lsdException w:name="List Table 7 Colorful Accent 2" w:uiPriority="52"/>
+    <w:lsdException w:name="List Table 1 Light Accent 3" w:uiPriority="46"/>
+    <w:lsdException w:name="List Table 2 Accent 3" w:uiPriority="47"/>
+    <w:lsdException w:name="List Table 3 Accent 3" w:uiPriority="48"/>
+    <w:lsdException w:name="List Table 4 Accent 3" w:uiPriority="49"/>
+    <w:lsdException w:name="List Table 5 Dark Accent 3" w:uiPriority="50"/>
+    <w:lsdException w:name="List Table 6 Colorful Accent 3" w:uiPriority="51"/>
+    <w:lsdException w:name="List Table 7 Colorful Accent 3" w:uiPriority="52"/>
+    <w:lsdException w:name="List Table 1 Light Accent 4" w:uiPriority="46"/>
+    <w:lsdException w:name="List Table 2 Accent 4" w:uiPriority="47"/>
+    <w:lsdException w:name="List Table 3 Accent 4" w:uiPriority="48"/>
+    <w:lsdException w:name="List Table 4 Accent 4" w:uiPriority="49"/>
+    <w:lsdException w:name="List Table 5 Dark Accent 4" w:uiPriority="50"/>
+    <w:lsdException w:name="List Table 6 Colorful Accent 4" w:uiPriority="51"/>
+    <w:lsdException w:name="List Table 7 Colorful Accent 4" w:uiPriority="52"/>
+    <w:lsdException w:name="List Table 1 Light Accent 5" w:uiPriority="46"/>
+    <w:lsdException w:name="List Table 2 Accent 5" w:uiPriority="47"/>
+    <w:lsdException w:name="List Table 3 Accent 5" w:uiPriority="48"/>
+    <w:lsdException w:name="List Table 4 Accent 5" w:uiPriority="49"/>
+    <w:lsdException w:name="List Table 5 Dark Accent 5" w:uiPriority="50"/>
+    <w:lsdException w:name="List Table 6 Colorful Accent 5" w:uiPriority="51"/>
+    <w:lsdException w:name="List Table 7 Colorful Accent 5" w:uiPriority="52"/>
+    <w:lsdException w:name="List Table 1 Light Accent 6" w:uiPriority="46"/>
+    <w:lsdException w:name="List Table 2 Accent 6" w:uiPriority="47"/>
+    <w:lsdException w:name="List Table 3 Accent 6" w:uiPriority="48"/>
+    <w:lsdException w:name="List Table 4 Accent 6" w:uiPriority="49"/>
+    <w:lsdException w:name="List Table 5 Dark Accent 6" w:uiPriority="50"/>
+    <w:lsdException w:name="List Table 6 Colorful Accent 6" w:uiPriority="51"/>
+    <w:lsdException w:name="List Table 7 Colorful Accent 6" w:uiPriority="52"/>
+  </w:latentStyles>
+  <w:style w:type="paragraph" w:default="1" w:styleId="Normal">
+    <w:name w:val="Normal"/>
+    <w:qFormat/>
+  </w:style>
+  <w:style w:type="paragraph" w:styleId="Heading1">
+    <w:name w:val="heading 1"/>
+    <w:basedOn w:val="Normal"/>
+    <w:next w:val="Normal"/>
+    <w:link w:val="Heading1Char"/>
+    <w:uiPriority w:val="9"/>
+    <w:qFormat/>
+    <w:rsid w:val="00F964B6"/>
+    <w:pPr>
+      <w:keepNext/>
+      <w:keepLines/>
+      <w:spacing w:before="240"/>
+      <w:outlineLvl w:val="0"/>
+    </w:pPr>
+    <w:rPr>
+      <w:rFonts w:asciiTheme="majorHAnsi" w:eastAsiaTheme="majorEastAsia" w:hAnsiTheme="majorHAnsi" w:cstheme="majorBidi"/>
+      <w:color w:val="2F5496" w:themeColor="accent1" w:themeShade="BF"/>
+      <w:sz w:val="32"/>
+      <w:szCs w:val="32"/>
+    </w:rPr>
+  </w:style>
+  <w:style w:type="character" w:default="1" w:styleId="DefaultParagraphFont">
+    <w:name w:val="Default Paragraph Font"/>
+    <w:uiPriority w:val="1"/>
+    <w:semiHidden/>
+    <w:unhideWhenUsed/>
+  </w:style>
+  <w:style w:type="table" w:default="1" w:styleId="TableNormal">
+    <w:name w:val="Normal Table"/>
+    <w:uiPriority w:val="99"/>
+    <w:semiHidden/>
+    <w:unhideWhenUsed/>
+    <w:tblPr>
+      <w:tblInd w:w="0" w:type="dxa"/>
+      <w:tblCellMar>
+        <w:top w:w="0" w:type="dxa"/>
+        <w:left w:w="108" w:type="dxa"/>
+        <w:bottom w:w="0" w:type="dxa"/>
+        <w:right w:w="108" w:type="dxa"/>
+      </w:tblCellMar>
+    </w:tblPr>
+  </w:style>
+  <w:style w:type="numbering" w:default="1" w:styleId="NoList">
+    <w:name w:val="No List"/>
+    <w:uiPriority w:val="99"/>
+    <w:semiHidden/>
+    <w:unhideWhenUsed/>
+  </w:style>
+  <w:style w:type="character" w:styleId="Hyperlink">
+    <w:name w:val="Hyperlink"/>
+    <w:basedOn w:val="DefaultParagraphFont"/>
+    <w:uiPriority w:val="99"/>
+    <w:unhideWhenUsed/>
+    <w:rsid w:val="00FE02A2"/>
+    <w:rPr>
+      <w:color w:val="0000FF"/>
+      <w:u w:val="single"/>
+    </w:rPr>
+  </w:style>
+  <w:style w:type="character" w:customStyle="1" w:styleId="d2l-offscreen">
+    <w:name w:val="d2l-offscreen"/>
+    <w:basedOn w:val="DefaultParagraphFont"/>
+    <w:rsid w:val="00FE02A2"/>
+  </w:style>
+  <w:style w:type="paragraph" w:styleId="ListParagraph">
+    <w:name w:val="List Paragraph"/>
+    <w:basedOn w:val="Normal"/>
+    <w:uiPriority w:val="34"/>
+    <w:qFormat/>
+    <w:rsid w:val="00FE02A2"/>
+    <w:pPr>
+      <w:ind w:left="720"/>
+      <w:contextualSpacing/>
+    </w:pPr>
+  </w:style>
+  <w:style w:type="paragraph" w:styleId="NormalWeb">
+    <w:name w:val="Normal (Web)"/>
+    <w:basedOn w:val="Normal"/>
+    <w:uiPriority w:val="99"/>
+    <w:semiHidden/>
+    <w:unhideWhenUsed/>
+    <w:rsid w:val="009D4A1E"/>
+    <w:pPr>
+      <w:spacing w:before="100" w:beforeAutospacing="1" w:after="100" w:afterAutospacing="1"/>
+    </w:pPr>
+    <w:rPr>
+      <w:rFonts w:ascii="Times New Roman" w:hAnsi="Times New Roman" w:cs="Times New Roman"/>
+    </w:rPr>
+  </w:style>
+  <w:style w:type="character" w:styleId="Emphasis">
+    <w:name w:val="Emphasis"/>
+    <w:basedOn w:val="DefaultParagraphFont"/>
+    <w:uiPriority w:val="20"/>
+    <w:qFormat/>
+    <w:rsid w:val="009D4A1E"/>
+    <w:rPr>
+      <w:i/>
+      <w:iCs/>
+    </w:rPr>
+  </w:style>
+  <w:style w:type="paragraph" w:styleId="Header">
+    <w:name w:val="header"/>
+    <w:basedOn w:val="Normal"/>
+    <w:link w:val="HeaderChar"/>
+    <w:uiPriority w:val="99"/>
+    <w:unhideWhenUsed/>
+    <w:rsid w:val="00AC000B"/>
+    <w:pPr>
+      <w:tabs>
+        <w:tab w:val="center" w:pos="4680"/>
+        <w:tab w:val="right" w:pos="9360"/>
+      </w:tabs>
+    </w:pPr>
+  </w:style>
+  <w:style w:type="character" w:customStyle="1" w:styleId="HeaderChar">
+    <w:name w:val="Header Char"/>
+    <w:basedOn w:val="DefaultParagraphFont"/>
+    <w:link w:val="Header"/>
+    <w:uiPriority w:val="99"/>
+    <w:rsid w:val="00AC000B"/>
+  </w:style>
+  <w:style w:type="paragraph" w:styleId="Footer">
+    <w:name w:val="footer"/>
+    <w:basedOn w:val="Normal"/>
+    <w:link w:val="FooterChar"/>
+    <w:uiPriority w:val="99"/>
+    <w:unhideWhenUsed/>
+    <w:rsid w:val="00AC000B"/>
+    <w:pPr>
+      <w:tabs>
+        <w:tab w:val="center" w:pos="4680"/>
+        <w:tab w:val="right" w:pos="9360"/>
+      </w:tabs>
+    </w:pPr>
+  </w:style>
+  <w:style w:type="character" w:customStyle="1" w:styleId="FooterChar">
+    <w:name w:val="Footer Char"/>
+    <w:basedOn w:val="DefaultParagraphFont"/>
+    <w:link w:val="Footer"/>
+    <w:uiPriority w:val="99"/>
+    <w:rsid w:val="00AC000B"/>
+  </w:style>
+  <w:style w:type="paragraph" w:styleId="Quote">
+    <w:name w:val="Quote"/>
+    <w:basedOn w:val="Normal"/>
+    <w:next w:val="Normal"/>
+    <w:link w:val="QuoteChar"/>
+    <w:uiPriority w:val="29"/>
+    <w:qFormat/>
+    <w:rsid w:val="00F964B6"/>
+    <w:pPr>
+      <w:spacing w:before="200" w:after="160"/>
+      <w:ind w:left="864" w:right="864"/>
+      <w:jc w:val="center"/>
+    </w:pPr>
+    <w:rPr>
+      <w:i/>
+      <w:iCs/>
+      <w:color w:val="404040" w:themeColor="text1" w:themeTint="BF"/>
+    </w:rPr>
+  </w:style>
+  <w:style w:type="character" w:customStyle="1" w:styleId="QuoteChar">
+    <w:name w:val="Quote Char"/>
+    <w:basedOn w:val="DefaultParagraphFont"/>
+    <w:link w:val="Quote"/>
+    <w:uiPriority w:val="29"/>
+    <w:rsid w:val="00F964B6"/>
+    <w:rPr>
+      <w:i/>
+      <w:iCs/>
+      <w:color w:val="404040" w:themeColor="text1" w:themeTint="BF"/>
+    </w:rPr>
+  </w:style>
+  <w:style w:type="character" w:customStyle="1" w:styleId="Heading1Char">
+    <w:name w:val="Heading 1 Char"/>
+    <w:basedOn w:val="DefaultParagraphFont"/>
+    <w:link w:val="Heading1"/>
+    <w:uiPriority w:val="9"/>
+    <w:rsid w:val="00F964B6"/>
+    <w:rPr>
+      <w:rFonts w:asciiTheme="majorHAnsi" w:eastAsiaTheme="majorEastAsia" w:hAnsiTheme="majorHAnsi" w:cstheme="majorBidi"/>
+      <w:color w:val="2F5496" w:themeColor="accent1" w:themeShade="BF"/>
+      <w:sz w:val="32"/>
+      <w:szCs w:val="32"/>
+    </w:rPr>
+  </w:style>
+  <w:style w:type="paragraph" w:styleId="Title">
+    <w:name w:val="Title"/>
+    <w:basedOn w:val="Normal"/>
+    <w:next w:val="Normal"/>
+    <w:link w:val="TitleChar"/>
+    <w:uiPriority w:val="10"/>
+    <w:qFormat/>
+    <w:rsid w:val="00F964B6"/>
+    <w:pPr>
+      <w:contextualSpacing/>
+    </w:pPr>
+    <w:rPr>
+      <w:rFonts w:asciiTheme="majorHAnsi" w:eastAsiaTheme="majorEastAsia" w:hAnsiTheme="majorHAnsi" w:cstheme="majorBidi"/>
+      <w:spacing w:val="-10"/>
+      <w:kern w:val="28"/>
+      <w:sz w:val="56"/>
+      <w:szCs w:val="56"/>
+    </w:rPr>
+  </w:style>
+  <w:style w:type="character" w:customStyle="1" w:styleId="TitleChar">
+    <w:name w:val="Title Char"/>
+    <w:basedOn w:val="DefaultParagraphFont"/>
+    <w:link w:val="Title"/>
+    <w:uiPriority w:val="10"/>
+    <w:rsid w:val="00F964B6"/>
+    <w:rPr>
+      <w:rFonts w:asciiTheme="majorHAnsi" w:eastAsiaTheme="majorEastAsia" w:hAnsiTheme="majorHAnsi" w:cstheme="majorBidi"/>
+      <w:spacing w:val="-10"/>
+      <w:kern w:val="28"/>
+      <w:sz w:val="56"/>
+      <w:szCs w:val="56"/>
+    </w:rPr>
+  </w:style>
+</w:styles>
+</file>
+
+<file path=word/theme/theme1.xml><?xml version="1.0" encoding="utf-8"?>
+<a:theme xmlns:a="http://schemas.openxmlformats.org/drawingml/2006/main" name="Office Theme">
+  <a:themeElements>
+    <a:clrScheme name="Office">
+      <a:dk1>
+        <a:sysClr val="windowText" lastClr="000000"/>
+      </a:dk1>
+      <a:lt1>
+        <a:sysClr val="window" lastClr="FFFFFF"/>
+      </a:lt1>
+      <a:dk2>
+        <a:srgbClr val="44546A"/>
+      </a:dk2>
+      <a:lt2>
+        <a:srgbClr val="E7E6E6"/>
+      </a:lt2>
+      <a:accent1>
+        <a:srgbClr val="4472C4"/>
+      </a:accent1>
+      <a:accent2>
+        <a:srgbClr val="ED7D31"/>
+      </a:accent2>
+      <a:accent3>
+        <a:srgbClr val="A5A5A5"/>
+      </a:accent3>
+      <a:accent4>
+        <a:srgbClr val="FFC000"/>
+      </a:accent4>
+      <a:accent5>
+        <a:srgbClr val="5B9BD5"/>
+      </a:accent5>
+      <a:accent6>
+        <a:srgbClr val="70AD47"/>
+      </a:accent6>
+      <a:hlink>
+        <a:srgbClr val="0563C1"/>
+      </a:hlink>
+      <a:folHlink>
+        <a:srgbClr val="954F72"/>
+      </a:folHlink>
+    </a:clrScheme>
+    <a:fontScheme name="Office">
+      <a:majorFont>
+        <a:latin typeface="Calibri Light" panose="020F0302020204030204"/>
+        <a:ea typeface=""/>
+        <a:cs typeface=""/>
+        <a:font script="Jpan" typeface="Yu Gothic Light"/>
+        <a:font script="Hang" typeface="맑은 고딕"/>
+        <a:font script="Hans" typeface="DengXian Light"/>
+        <a:font script="Hant" typeface="新細明體"/>
+        <a:font script="Arab" typeface="Times New Roman"/>
+        <a:font script="Hebr" typeface="Times New Roman"/>
+        <a:font script="Thai" typeface="Angsana New"/>
+        <a:font script="Ethi" typeface="Nyala"/>
+        <a:font script="Beng" typeface="Vrinda"/>
+        <a:font script="Gujr" typeface="Shruti"/>
+        <a:font script="Khmr" typeface="MoolBoran"/>
+        <a:font script="Knda" typeface="Tunga"/>
+        <a:font script="Guru" typeface="Raavi"/>
+        <a:font script="Cans" typeface="Euphemia"/>
+        <a:font script="Cher" typeface="Plantagenet Cherokee"/>
+        <a:font script="Yiii" typeface="Microsoft Yi Baiti"/>
+        <a:font script="Tibt" typeface="Microsoft Himalaya"/>
+        <a:font script="Thaa" typeface="MV Boli"/>
+        <a:font script="Deva" typeface="Mangal"/>
+        <a:font script="Telu" typeface="Gautami"/>
+        <a:font script="Taml" typeface="Latha"/>
+        <a:font script="Syrc" typeface="Estrangelo Edessa"/>
+        <a:font script="Orya" typeface="Kalinga"/>
+        <a:font script="Mlym" typeface="Kartika"/>
+        <a:font script="Laoo" typeface="DokChampa"/>
+        <a:font script="Sinh" typeface="Iskoola Pota"/>
+        <a:font script="Mong" typeface="Mongolian Baiti"/>
+        <a:font script="Viet" typeface="Times New Roman"/>
+        <a:font script="Uigh" typeface="Microsoft Uighur"/>
+        <a:font script="Geor" typeface="Sylfaen"/>
+      </a:majorFont>
+      <a:minorFont>
+        <a:latin typeface="Calibri" panose="020F0502020204030204"/>
+        <a:ea typeface=""/>
+        <a:cs typeface=""/>
+        <a:font script="Jpan" typeface="Yu Mincho"/>
+        <a:font script="Hang" typeface="맑은 고딕"/>
+        <a:font script="Hans" typeface="DengXian"/>
+        <a:font script="Hant" typeface="新細明體"/>
+        <a:font script="Arab" typeface="Arial"/>
+        <a:font script="Hebr" typeface="Arial"/>
+        <a:font script="Thai" typeface="Cordia New"/>
+        <a:font script="Ethi" typeface="Nyala"/>
+        <a:font script="Beng" typeface="Vrinda"/>
+        <a:font script="Gujr" typeface="Shruti"/>
+        <a:font script="Khmr" typeface="DaunPenh"/>
+        <a:font script="Knda" typeface="Tunga"/>
+        <a:font script="Guru" typeface="Raavi"/>
+        <a:font script="Cans" typeface="Euphemia"/>
+        <a:font script="Cher" typeface="Plantagenet Cherokee"/>
+        <a:font script="Yiii" typeface="Microsoft Yi Baiti"/>
+        <a:font script="Tibt" typeface="Microsoft Himalaya"/>
+        <a:font script="Thaa" typeface="MV Boli"/>
+        <a:font script="Deva" typeface="Mangal"/>
+        <a:font script="Telu" typeface="Gautami"/>
+        <a:font script="Taml" typeface="Latha"/>
+        <a:font script="Syrc" typeface="Estrangelo Edessa"/>
+        <a:font script="Orya" typeface="Kalinga"/>
+        <a:font script="Mlym" typeface="Kartika"/>
+        <a:font script="Laoo" typeface="DokChampa"/>
+        <a:font script="Sinh" typeface="Iskoola Pota"/>
+        <a:font script="Mong" typeface="Mongolian Baiti"/>
+        <a:font script="Viet" typeface="Arial"/>
+        <a:font script="Uigh" typeface="Microsoft Uighur"/>
+        <a:font script="Geor" typeface="Sylfaen"/>
+      </a:minorFont>
+    </a:fontScheme>
+    <a:fmtScheme name="Office">
+      <a:fillStyleLst>
+        <a:solidFill>
+          <a:schemeClr val="phClr"/>
+        </a:solidFill>
+        <a:gradFill rotWithShape="1">
+          <a:gsLst>
+            <a:gs pos="0">
+              <a:schemeClr val="phClr">
+                <a:lumMod val="110000"/>
+                <a:satMod val="105000"/>
+                <a:tint val="67000"/>
+              </a:schemeClr>
+            </a:gs>
+            <a:gs pos="50000">
+              <a:schemeClr val="phClr">
+                <a:lumMod val="105000"/>
+                <a:satMod val="103000"/>
+                <a:tint val="73000"/>
+              </a:schemeClr>
+            </a:gs>
+            <a:gs pos="100000">
+              <a:schemeClr val="phClr">
+                <a:lumMod val="105000"/>
+                <a:satMod val="109000"/>
+                <a:tint val="81000"/>
+              </a:schemeClr>
+            </a:gs>
+          </a:gsLst>
+          <a:lin ang="5400000" scaled="0"/>
+        </a:gradFill>
+        <a:gradFill rotWithShape="1">
+          <a:gsLst>
+            <a:gs pos="0">
+              <a:schemeClr val="phClr">
+                <a:satMod val="103000"/>
+                <a:lumMod val="102000"/>
+                <a:tint val="94000"/>
+              </a:schemeClr>
+            </a:gs>
+            <a:gs pos="50000">
+              <a:schemeClr val="phClr">
+                <a:satMod val="110000"/>
+                <a:lumMod val="100000"/>
+                <a:shade val="100000"/>
+              </a:schemeClr>
+            </a:gs>
+            <a:gs pos="100000">
+              <a:schemeClr val="phClr">
+                <a:lumMod val="99000"/>
+                <a:satMod val="120000"/>
+                <a:shade val="78000"/>
+              </a:schemeClr>
+            </a:gs>
+          </a:gsLst>
+          <a:lin ang="5400000" scaled="0"/>
+        </a:gradFill>
+      </a:fillStyleLst>
+      <a:lnStyleLst>
+        <a:ln w="6350" cap="flat" cmpd="sng" algn="ctr">
+          <a:solidFill>
+            <a:schemeClr val="phClr"/>
+          </a:solidFill>
+          <a:prstDash val="solid"/>
+          <a:miter lim="800000"/>
+        </a:ln>
+        <a:ln w="12700" cap="flat" cmpd="sng" algn="ctr">
+          <a:solidFill>
+            <a:schemeClr val="phClr"/>
+          </a:solidFill>
+          <a:prstDash val="solid"/>
+          <a:miter lim="800000"/>
+        </a:ln>
+        <a:ln w="19050" cap="flat" cmpd="sng" algn="ctr">
+          <a:solidFill>
+            <a:schemeClr val="phClr"/>
+          </a:solidFill>
+          <a:prstDash val="solid"/>
+          <a:miter lim="800000"/>
+        </a:ln>
+      </a:lnStyleLst>
+      <a:effectStyleLst>
+        <a:effectStyle>
+          <a:effectLst/>
+        </a:effectStyle>
+        <a:effectStyle>
+          <a:effectLst/>
+        </a:effectStyle>
+        <a:effectStyle>
+          <a:effectLst>
+            <a:outerShdw blurRad="57150" dist="19050" dir="5400000" algn="ctr" rotWithShape="0">
+              <a:srgbClr val="000000">
+                <a:alpha val="63000"/>
+              </a:srgbClr>
+            </a:outerShdw>
+          </a:effectLst>
+        </a:effectStyle>
+      </a:effectStyleLst>
+      <a:bgFillStyleLst>
+        <a:solidFill>
+          <a:schemeClr val="phClr"/>
+        </a:solidFill>
+        <a:solidFill>
+          <a:schemeClr val="phClr">
+            <a:tint val="95000"/>
+            <a:satMod val="170000"/>
+          </a:schemeClr>
+        </a:solidFill>
+        <a:gradFill rotWithShape="1">
+          <a:gsLst>
+            <a:gs pos="0">
+              <a:schemeClr val="phClr">
+                <a:tint val="93000"/>
+                <a:satMod val="150000"/>
+                <a:shade val="98000"/>
+                <a:lumMod val="102000"/>
+              </a:schemeClr>
+            </a:gs>
+            <a:gs pos="50000">
+              <a:schemeClr val="phClr">
+                <a:tint val="98000"/>
+                <a:satMod val="130000"/>
+                <a:shade val="90000"/>
+                <a:lumMod val="103000"/>
+              </a:schemeClr>
+            </a:gs>
+            <a:gs pos="100000">
+              <a:schemeClr val="phClr">
+                <a:shade val="63000"/>
+                <a:satMod val="120000"/>
+              </a:schemeClr>
+            </a:gs>
+          </a:gsLst>
+          <a:lin ang="5400000" scaled="0"/>
+        </a:gradFill>
+      </a:bgFillStyleLst>
+    </a:fmtScheme>
+  </a:themeElements>
+  <a:objectDefaults/>
+  <a:extraClrSchemeLst/>
+  <a:extLst>
+    <a:ext uri="{05A4C25C-085E-4340-85A3-A5531E510DB2}">
+      <thm15:themeFamily xmlns:thm15="http://schemas.microsoft.com/office/thememl/2012/main" name="Office Theme" id="{62F939B6-93AF-4DB8-9C6B-D6C7DFDC589F}" vid="{4A3C46E8-61CC-4603-A589-7422A47A8E4A}"/>
+    </a:ext>
+  </a:extLst>
+</a:theme>
 </file>
</xml_diff>